<commit_message>
Additional commits with a readme.md
</commit_message>
<xml_diff>
--- a/DXV-FRE-000_Test-Suite-Overview.docx
+++ b/DXV-FRE-000_Test-Suite-Overview.docx
@@ -79,7 +79,6 @@
     </w:p>
     <w:tbl>
       <w:tblPr>
-        <w:tblW w:type="auto" w:w="0"/>
         <w:tblLook w:firstColumn="1" w:firstRow="1" w:lastColumn="0" w:lastRow="0" w:noHBand="0" w:noVBand="1" w:val="04A0"/>
         <w:tblLayout w:type="fixed"/>
         <w:tblBorders>
@@ -90,17 +89,18 @@
           <w:insideH w:val="single" w:sz="8" w:space="0" w:color="FFFFFF"/>
           <w:insideV w:val="single" w:sz="8" w:space="0" w:color="FFFFFF"/>
         </w:tblBorders>
+        <w:tblW w:w="10296" w:type="dxa"/>
       </w:tblPr>
       <w:tblGrid>
-        <w:gridCol w:w="2592"/>
-        <w:gridCol w:w="2592"/>
-        <w:gridCol w:w="2592"/>
-        <w:gridCol w:w="2592"/>
+        <w:gridCol w:w="2304"/>
+        <w:gridCol w:w="2880"/>
+        <w:gridCol w:w="2448"/>
+        <w:gridCol w:w="2664"/>
       </w:tblGrid>
       <w:tr>
         <w:tc>
           <w:tcPr>
-            <w:tcW w:type="dxa" w:w="2304"/>
+            <w:tcW w:w="2304" w:type="dxa"/>
             <w:tcMar>
               <w:top w:w="60" w:type="dxa"/>
               <w:bottom w:w="60" w:type="dxa"/>
@@ -128,7 +128,7 @@
         </w:tc>
         <w:tc>
           <w:tcPr>
-            <w:tcW w:type="dxa" w:w="2880"/>
+            <w:tcW w:w="2880" w:type="dxa"/>
             <w:tcMar>
               <w:top w:w="60" w:type="dxa"/>
               <w:bottom w:w="60" w:type="dxa"/>
@@ -155,7 +155,7 @@
         </w:tc>
         <w:tc>
           <w:tcPr>
-            <w:tcW w:type="dxa" w:w="2448"/>
+            <w:tcW w:w="2448" w:type="dxa"/>
             <w:tcMar>
               <w:top w:w="60" w:type="dxa"/>
               <w:bottom w:w="60" w:type="dxa"/>
@@ -183,7 +183,7 @@
         </w:tc>
         <w:tc>
           <w:tcPr>
-            <w:tcW w:type="dxa" w:w="2664"/>
+            <w:tcW w:w="2664" w:type="dxa"/>
             <w:tcMar>
               <w:top w:w="60" w:type="dxa"/>
               <w:bottom w:w="60" w:type="dxa"/>
@@ -212,7 +212,7 @@
       <w:tr>
         <w:tc>
           <w:tcPr>
-            <w:tcW w:type="dxa" w:w="2304"/>
+            <w:tcW w:w="2304" w:type="dxa"/>
             <w:tcMar>
               <w:top w:w="60" w:type="dxa"/>
               <w:bottom w:w="60" w:type="dxa"/>
@@ -240,7 +240,7 @@
         </w:tc>
         <w:tc>
           <w:tcPr>
-            <w:tcW w:type="dxa" w:w="2880"/>
+            <w:tcW w:w="2880" w:type="dxa"/>
             <w:tcMar>
               <w:top w:w="60" w:type="dxa"/>
               <w:bottom w:w="60" w:type="dxa"/>
@@ -267,7 +267,7 @@
         </w:tc>
         <w:tc>
           <w:tcPr>
-            <w:tcW w:type="dxa" w:w="2448"/>
+            <w:tcW w:w="2448" w:type="dxa"/>
             <w:tcMar>
               <w:top w:w="60" w:type="dxa"/>
               <w:bottom w:w="60" w:type="dxa"/>
@@ -295,7 +295,7 @@
         </w:tc>
         <w:tc>
           <w:tcPr>
-            <w:tcW w:type="dxa" w:w="2664"/>
+            <w:tcW w:w="2664" w:type="dxa"/>
             <w:tcMar>
               <w:top w:w="60" w:type="dxa"/>
               <w:bottom w:w="60" w:type="dxa"/>
@@ -324,7 +324,7 @@
       <w:tr>
         <w:tc>
           <w:tcPr>
-            <w:tcW w:type="dxa" w:w="2304"/>
+            <w:tcW w:w="2304" w:type="dxa"/>
             <w:tcMar>
               <w:top w:w="60" w:type="dxa"/>
               <w:bottom w:w="60" w:type="dxa"/>
@@ -352,7 +352,7 @@
         </w:tc>
         <w:tc>
           <w:tcPr>
-            <w:tcW w:type="dxa" w:w="2880"/>
+            <w:tcW w:w="2880" w:type="dxa"/>
             <w:tcMar>
               <w:top w:w="60" w:type="dxa"/>
               <w:bottom w:w="60" w:type="dxa"/>
@@ -379,7 +379,7 @@
         </w:tc>
         <w:tc>
           <w:tcPr>
-            <w:tcW w:type="dxa" w:w="2448"/>
+            <w:tcW w:w="2448" w:type="dxa"/>
             <w:tcMar>
               <w:top w:w="60" w:type="dxa"/>
               <w:bottom w:w="60" w:type="dxa"/>
@@ -407,7 +407,7 @@
         </w:tc>
         <w:tc>
           <w:tcPr>
-            <w:tcW w:type="dxa" w:w="2664"/>
+            <w:tcW w:w="2664" w:type="dxa"/>
             <w:tcMar>
               <w:top w:w="60" w:type="dxa"/>
               <w:bottom w:w="60" w:type="dxa"/>
@@ -436,7 +436,7 @@
       <w:tr>
         <w:tc>
           <w:tcPr>
-            <w:tcW w:type="dxa" w:w="2304"/>
+            <w:tcW w:w="2304" w:type="dxa"/>
             <w:tcMar>
               <w:top w:w="60" w:type="dxa"/>
               <w:bottom w:w="60" w:type="dxa"/>
@@ -464,7 +464,7 @@
         </w:tc>
         <w:tc>
           <w:tcPr>
-            <w:tcW w:type="dxa" w:w="2880"/>
+            <w:tcW w:w="2880" w:type="dxa"/>
             <w:tcMar>
               <w:top w:w="60" w:type="dxa"/>
               <w:bottom w:w="60" w:type="dxa"/>
@@ -491,7 +491,7 @@
         </w:tc>
         <w:tc>
           <w:tcPr>
-            <w:tcW w:type="dxa" w:w="2448"/>
+            <w:tcW w:w="2448" w:type="dxa"/>
             <w:tcMar>
               <w:top w:w="60" w:type="dxa"/>
               <w:bottom w:w="60" w:type="dxa"/>
@@ -519,7 +519,7 @@
         </w:tc>
         <w:tc>
           <w:tcPr>
-            <w:tcW w:type="dxa" w:w="2664"/>
+            <w:tcW w:w="2664" w:type="dxa"/>
             <w:tcMar>
               <w:top w:w="60" w:type="dxa"/>
               <w:bottom w:w="60" w:type="dxa"/>
@@ -598,7 +598,6 @@
     </w:p>
     <w:tbl>
       <w:tblPr>
-        <w:tblW w:type="auto" w:w="0"/>
         <w:jc w:val="center"/>
         <w:tblLook w:firstColumn="1" w:firstRow="1" w:lastColumn="0" w:lastRow="0" w:noHBand="0" w:noVBand="1" w:val="04A0"/>
         <w:tblBorders>
@@ -610,14 +609,15 @@
           <w:insideV w:val="none" w:sz="0" w:space="0" w:color="auto"/>
         </w:tblBorders>
         <w:tblLayout w:type="fixed"/>
+        <w:tblW w:w="10296" w:type="dxa"/>
       </w:tblPr>
       <w:tblGrid>
-        <w:gridCol w:w="10368"/>
+        <w:gridCol w:w="10296"/>
       </w:tblGrid>
       <w:tr>
         <w:tc>
           <w:tcPr>
-            <w:tcW w:type="dxa" w:w="10296"/>
+            <w:tcW w:w="10296" w:type="dxa"/>
             <w:shd w:val="clear" w:color="auto" w:fill="ECF7EE"/>
             <w:tcBorders>
               <w:left w:val="single" w:sz="24" w:space="0" w:color="2E9E4F"/>
@@ -881,7 +881,6 @@
     </w:p>
     <w:tbl>
       <w:tblPr>
-        <w:tblW w:type="auto" w:w="0"/>
         <w:jc w:val="center"/>
         <w:tblLook w:firstColumn="1" w:firstRow="1" w:lastColumn="0" w:lastRow="0" w:noHBand="0" w:noVBand="1" w:val="04A0"/>
         <w:tblBorders>
@@ -893,14 +892,15 @@
           <w:insideV w:val="none" w:sz="0" w:space="0" w:color="auto"/>
         </w:tblBorders>
         <w:tblLayout w:type="fixed"/>
+        <w:tblW w:w="10296" w:type="dxa"/>
       </w:tblPr>
       <w:tblGrid>
-        <w:gridCol w:w="10368"/>
+        <w:gridCol w:w="10296"/>
       </w:tblGrid>
       <w:tr>
         <w:tc>
           <w:tcPr>
-            <w:tcW w:type="dxa" w:w="10296"/>
+            <w:tcW w:w="10296" w:type="dxa"/>
             <w:shd w:val="clear" w:color="auto" w:fill="FDF3E7"/>
             <w:tcBorders>
               <w:left w:val="single" w:sz="24" w:space="0" w:color="D9822B"/>
@@ -1038,7 +1038,6 @@
     </w:p>
     <w:tbl>
       <w:tblPr>
-        <w:tblW w:type="auto" w:w="0"/>
         <w:tblLook w:firstColumn="1" w:firstRow="1" w:lastColumn="0" w:lastRow="0" w:noHBand="0" w:noVBand="1" w:val="04A0"/>
         <w:tblLayout w:type="fixed"/>
         <w:tblBorders>
@@ -1049,15 +1048,16 @@
           <w:insideH w:val="single" w:sz="4" w:space="0" w:color="C9D0E0"/>
           <w:insideV w:val="single" w:sz="4" w:space="0" w:color="C9D0E0"/>
         </w:tblBorders>
+        <w:tblW w:w="10296" w:type="dxa"/>
       </w:tblPr>
       <w:tblGrid>
-        <w:gridCol w:w="5184"/>
-        <w:gridCol w:w="5184"/>
+        <w:gridCol w:w="3312"/>
+        <w:gridCol w:w="6984"/>
       </w:tblGrid>
       <w:tr>
         <w:tc>
           <w:tcPr>
-            <w:tcW w:type="dxa" w:w="3312"/>
+            <w:tcW w:w="3312" w:type="dxa"/>
             <w:shd w:val="clear" w:color="auto" w:fill="E8ECF6"/>
             <w:tcMar>
               <w:top w:w="50" w:type="dxa"/>
@@ -1081,7 +1081,7 @@
         </w:tc>
         <w:tc>
           <w:tcPr>
-            <w:tcW w:type="dxa" w:w="6984"/>
+            <w:tcW w:w="6984" w:type="dxa"/>
             <w:shd w:val="clear" w:color="auto" w:fill="FFFFFF"/>
             <w:tcMar>
               <w:top w:w="50" w:type="dxa"/>
@@ -1105,7 +1105,7 @@
       <w:tr>
         <w:tc>
           <w:tcPr>
-            <w:tcW w:type="dxa" w:w="3312"/>
+            <w:tcW w:w="3312" w:type="dxa"/>
             <w:shd w:val="clear" w:color="auto" w:fill="F2F5FB"/>
             <w:tcMar>
               <w:top w:w="50" w:type="dxa"/>
@@ -1129,7 +1129,7 @@
         </w:tc>
         <w:tc>
           <w:tcPr>
-            <w:tcW w:type="dxa" w:w="6984"/>
+            <w:tcW w:w="6984" w:type="dxa"/>
             <w:shd w:val="clear" w:color="auto" w:fill="FAFBFE"/>
             <w:tcMar>
               <w:top w:w="50" w:type="dxa"/>
@@ -1153,7 +1153,7 @@
       <w:tr>
         <w:tc>
           <w:tcPr>
-            <w:tcW w:type="dxa" w:w="3312"/>
+            <w:tcW w:w="3312" w:type="dxa"/>
             <w:shd w:val="clear" w:color="auto" w:fill="E8ECF6"/>
             <w:tcMar>
               <w:top w:w="50" w:type="dxa"/>
@@ -1177,7 +1177,7 @@
         </w:tc>
         <w:tc>
           <w:tcPr>
-            <w:tcW w:type="dxa" w:w="6984"/>
+            <w:tcW w:w="6984" w:type="dxa"/>
             <w:shd w:val="clear" w:color="auto" w:fill="FFFFFF"/>
             <w:tcMar>
               <w:top w:w="50" w:type="dxa"/>
@@ -1201,7 +1201,7 @@
       <w:tr>
         <w:tc>
           <w:tcPr>
-            <w:tcW w:type="dxa" w:w="3312"/>
+            <w:tcW w:w="3312" w:type="dxa"/>
             <w:shd w:val="clear" w:color="auto" w:fill="F2F5FB"/>
             <w:tcMar>
               <w:top w:w="50" w:type="dxa"/>
@@ -1225,7 +1225,7 @@
         </w:tc>
         <w:tc>
           <w:tcPr>
-            <w:tcW w:type="dxa" w:w="6984"/>
+            <w:tcW w:w="6984" w:type="dxa"/>
             <w:shd w:val="clear" w:color="auto" w:fill="FAFBFE"/>
             <w:tcMar>
               <w:top w:w="50" w:type="dxa"/>
@@ -1249,7 +1249,7 @@
       <w:tr>
         <w:tc>
           <w:tcPr>
-            <w:tcW w:type="dxa" w:w="3312"/>
+            <w:tcW w:w="3312" w:type="dxa"/>
             <w:shd w:val="clear" w:color="auto" w:fill="E8ECF6"/>
             <w:tcMar>
               <w:top w:w="50" w:type="dxa"/>
@@ -1273,7 +1273,7 @@
         </w:tc>
         <w:tc>
           <w:tcPr>
-            <w:tcW w:type="dxa" w:w="6984"/>
+            <w:tcW w:w="6984" w:type="dxa"/>
             <w:shd w:val="clear" w:color="auto" w:fill="FFFFFF"/>
             <w:tcMar>
               <w:top w:w="50" w:type="dxa"/>
@@ -1314,7 +1314,6 @@
     </w:p>
     <w:tbl>
       <w:tblPr>
-        <w:tblW w:type="auto" w:w="0"/>
         <w:tblLook w:firstColumn="1" w:firstRow="1" w:lastColumn="0" w:lastRow="0" w:noHBand="0" w:noVBand="1" w:val="04A0"/>
         <w:tblLayout w:type="fixed"/>
         <w:tblBorders>
@@ -1325,13 +1324,14 @@
           <w:insideH w:val="single" w:sz="4" w:space="0" w:color="C9D0E0"/>
           <w:insideV w:val="single" w:sz="4" w:space="0" w:color="C9D0E0"/>
         </w:tblBorders>
+        <w:tblW w:w="9648" w:type="dxa"/>
       </w:tblPr>
       <w:tblGrid>
-        <w:gridCol w:w="2074"/>
-        <w:gridCol w:w="2074"/>
-        <w:gridCol w:w="2074"/>
-        <w:gridCol w:w="2074"/>
-        <w:gridCol w:w="2074"/>
+        <w:gridCol w:w="1440"/>
+        <w:gridCol w:w="3672"/>
+        <w:gridCol w:w="2664"/>
+        <w:gridCol w:w="648"/>
+        <w:gridCol w:w="1224"/>
       </w:tblGrid>
       <w:tr>
         <w:trPr>
@@ -1339,15 +1339,15 @@
         </w:trPr>
         <w:tc>
           <w:tcPr>
-            <w:tcW w:type="dxa" w:w="1656"/>
+            <w:tcW w:w="1440" w:type="dxa"/>
             <w:shd w:val="clear" w:color="auto" w:fill="1F2A56"/>
             <w:tcMar>
               <w:top w:w="55" w:type="dxa"/>
               <w:bottom w:w="55" w:type="dxa"/>
-              <w:start w:w="90" w:type="dxa"/>
-              <w:end w:w="90" w:type="dxa"/>
-              <w:left w:w="90" w:type="dxa"/>
-              <w:right w:w="90" w:type="dxa"/>
+              <w:start w:w="70" w:type="dxa"/>
+              <w:end w:w="70" w:type="dxa"/>
+              <w:left w:w="70" w:type="dxa"/>
+              <w:right w:w="70" w:type="dxa"/>
             </w:tcMar>
             <w:vAlign w:val="center"/>
           </w:tcPr>
@@ -1359,7 +1359,7 @@
               <w:rPr>
                 <w:b/>
                 <w:color w:val="FFFFFF"/>
-                <w:sz w:val="18"/>
+                <w:sz w:val="17"/>
               </w:rPr>
               <w:t>Story Key</w:t>
             </w:r>
@@ -1367,15 +1367,15 @@
         </w:tc>
         <w:tc>
           <w:tcPr>
-            <w:tcW w:type="dxa" w:w="4104"/>
+            <w:tcW w:w="3672" w:type="dxa"/>
             <w:shd w:val="clear" w:color="auto" w:fill="1F2A56"/>
             <w:tcMar>
               <w:top w:w="55" w:type="dxa"/>
               <w:bottom w:w="55" w:type="dxa"/>
-              <w:start w:w="90" w:type="dxa"/>
-              <w:end w:w="90" w:type="dxa"/>
-              <w:left w:w="90" w:type="dxa"/>
-              <w:right w:w="90" w:type="dxa"/>
+              <w:start w:w="70" w:type="dxa"/>
+              <w:end w:w="70" w:type="dxa"/>
+              <w:left w:w="70" w:type="dxa"/>
+              <w:right w:w="70" w:type="dxa"/>
             </w:tcMar>
             <w:vAlign w:val="center"/>
           </w:tcPr>
@@ -1387,7 +1387,7 @@
               <w:rPr>
                 <w:b/>
                 <w:color w:val="FFFFFF"/>
-                <w:sz w:val="18"/>
+                <w:sz w:val="17"/>
               </w:rPr>
               <w:t>Functional Area / Title</w:t>
             </w:r>
@@ -1395,15 +1395,15 @@
         </w:tc>
         <w:tc>
           <w:tcPr>
-            <w:tcW w:type="dxa" w:w="2808"/>
+            <w:tcW w:w="2664" w:type="dxa"/>
             <w:shd w:val="clear" w:color="auto" w:fill="1F2A56"/>
             <w:tcMar>
               <w:top w:w="55" w:type="dxa"/>
               <w:bottom w:w="55" w:type="dxa"/>
-              <w:start w:w="90" w:type="dxa"/>
-              <w:end w:w="90" w:type="dxa"/>
-              <w:left w:w="90" w:type="dxa"/>
-              <w:right w:w="90" w:type="dxa"/>
+              <w:start w:w="70" w:type="dxa"/>
+              <w:end w:w="70" w:type="dxa"/>
+              <w:left w:w="70" w:type="dxa"/>
+              <w:right w:w="70" w:type="dxa"/>
             </w:tcMar>
             <w:vAlign w:val="center"/>
           </w:tcPr>
@@ -1415,7 +1415,7 @@
               <w:rPr>
                 <w:b/>
                 <w:color w:val="FFFFFF"/>
-                <w:sz w:val="18"/>
+                <w:sz w:val="17"/>
               </w:rPr>
               <w:t>Epic Theme</w:t>
             </w:r>
@@ -1423,15 +1423,15 @@
         </w:tc>
         <w:tc>
           <w:tcPr>
-            <w:tcW w:type="dxa" w:w="864"/>
+            <w:tcW w:w="648" w:type="dxa"/>
             <w:shd w:val="clear" w:color="auto" w:fill="1F2A56"/>
             <w:tcMar>
               <w:top w:w="55" w:type="dxa"/>
               <w:bottom w:w="55" w:type="dxa"/>
-              <w:start w:w="90" w:type="dxa"/>
-              <w:end w:w="90" w:type="dxa"/>
-              <w:left w:w="90" w:type="dxa"/>
-              <w:right w:w="90" w:type="dxa"/>
+              <w:start w:w="70" w:type="dxa"/>
+              <w:end w:w="70" w:type="dxa"/>
+              <w:left w:w="70" w:type="dxa"/>
+              <w:right w:w="70" w:type="dxa"/>
             </w:tcMar>
             <w:vAlign w:val="center"/>
           </w:tcPr>
@@ -1443,7 +1443,7 @@
               <w:rPr>
                 <w:b/>
                 <w:color w:val="FFFFFF"/>
-                <w:sz w:val="18"/>
+                <w:sz w:val="17"/>
               </w:rPr>
               <w:t>TCs</w:t>
             </w:r>
@@ -1451,15 +1451,15 @@
         </w:tc>
         <w:tc>
           <w:tcPr>
-            <w:tcW w:type="dxa" w:w="864"/>
+            <w:tcW w:w="1224" w:type="dxa"/>
             <w:shd w:val="clear" w:color="auto" w:fill="1F2A56"/>
             <w:tcMar>
               <w:top w:w="55" w:type="dxa"/>
               <w:bottom w:w="55" w:type="dxa"/>
-              <w:start w:w="90" w:type="dxa"/>
-              <w:end w:w="90" w:type="dxa"/>
-              <w:left w:w="90" w:type="dxa"/>
-              <w:right w:w="90" w:type="dxa"/>
+              <w:start w:w="70" w:type="dxa"/>
+              <w:end w:w="70" w:type="dxa"/>
+              <w:left w:w="70" w:type="dxa"/>
+              <w:right w:w="70" w:type="dxa"/>
             </w:tcMar>
             <w:vAlign w:val="center"/>
           </w:tcPr>
@@ -1471,9 +1471,9 @@
               <w:rPr>
                 <w:b/>
                 <w:color w:val="FFFFFF"/>
-                <w:sz w:val="18"/>
+                <w:sz w:val="17"/>
               </w:rPr>
-              <w:t>Pri</w:t>
+              <w:t>Priority</w:t>
             </w:r>
           </w:p>
         </w:tc>
@@ -1481,15 +1481,15 @@
       <w:tr>
         <w:tc>
           <w:tcPr>
-            <w:tcW w:type="dxa" w:w="2074"/>
+            <w:tcW w:type="dxa" w:w="1440"/>
             <w:shd w:val="clear" w:color="auto" w:fill="EEF1F8"/>
             <w:tcMar>
               <w:top w:w="50" w:type="dxa"/>
               <w:bottom w:w="50" w:type="dxa"/>
-              <w:start w:w="90" w:type="dxa"/>
-              <w:end w:w="90" w:type="dxa"/>
-              <w:left w:w="90" w:type="dxa"/>
-              <w:right w:w="90" w:type="dxa"/>
+              <w:start w:w="70" w:type="dxa"/>
+              <w:end w:w="70" w:type="dxa"/>
+              <w:left w:w="70" w:type="dxa"/>
+              <w:right w:w="70" w:type="dxa"/>
             </w:tcMar>
             <w:vAlign w:val="center"/>
           </w:tcPr>
@@ -1498,7 +1498,7 @@
               <w:rPr>
                 <w:b/>
                 <w:color w:val="2E3C74"/>
-                <w:sz w:val="18"/>
+                <w:sz w:val="17"/>
               </w:rPr>
               <w:t>DXV-FRE-001</w:t>
             </w:r>
@@ -1506,22 +1506,22 @@
         </w:tc>
         <w:tc>
           <w:tcPr>
-            <w:tcW w:type="dxa" w:w="2074"/>
+            <w:tcW w:type="dxa" w:w="3672"/>
             <w:shd w:val="clear" w:color="auto" w:fill="EEF1F8"/>
             <w:tcMar>
               <w:top w:w="50" w:type="dxa"/>
               <w:bottom w:w="50" w:type="dxa"/>
-              <w:start w:w="90" w:type="dxa"/>
-              <w:end w:w="90" w:type="dxa"/>
-              <w:left w:w="90" w:type="dxa"/>
-              <w:right w:w="90" w:type="dxa"/>
+              <w:start w:w="70" w:type="dxa"/>
+              <w:end w:w="70" w:type="dxa"/>
+              <w:left w:w="70" w:type="dxa"/>
+              <w:right w:w="70" w:type="dxa"/>
             </w:tcMar>
             <w:vAlign w:val="center"/>
           </w:tcPr>
           <w:p>
             <w:r>
               <w:rPr>
-                <w:sz w:val="18"/>
+                <w:sz w:val="17"/>
               </w:rPr>
               <w:t>Invoke the failed-record-export pipeline with correct parameter resolution</w:t>
             </w:r>
@@ -1529,15 +1529,15 @@
         </w:tc>
         <w:tc>
           <w:tcPr>
-            <w:tcW w:type="dxa" w:w="2074"/>
+            <w:tcW w:type="dxa" w:w="2664"/>
             <w:shd w:val="clear" w:color="auto" w:fill="EEF1F8"/>
             <w:tcMar>
               <w:top w:w="50" w:type="dxa"/>
               <w:bottom w:w="50" w:type="dxa"/>
-              <w:start w:w="90" w:type="dxa"/>
-              <w:end w:w="90" w:type="dxa"/>
-              <w:left w:w="90" w:type="dxa"/>
-              <w:right w:w="90" w:type="dxa"/>
+              <w:start w:w="70" w:type="dxa"/>
+              <w:end w:w="70" w:type="dxa"/>
+              <w:left w:w="70" w:type="dxa"/>
+              <w:right w:w="70" w:type="dxa"/>
             </w:tcMar>
             <w:vAlign w:val="center"/>
           </w:tcPr>
@@ -1545,7 +1545,7 @@
             <w:r>
               <w:rPr>
                 <w:color w:val="3C4A66"/>
-                <w:sz w:val="17"/>
+                <w:sz w:val="16"/>
               </w:rPr>
               <w:t>Pipeline Orchestration &amp; Configuration</w:t>
             </w:r>
@@ -1553,15 +1553,15 @@
         </w:tc>
         <w:tc>
           <w:tcPr>
-            <w:tcW w:type="dxa" w:w="2074"/>
+            <w:tcW w:type="dxa" w:w="648"/>
             <w:shd w:val="clear" w:color="auto" w:fill="EEF1F8"/>
             <w:tcMar>
               <w:top w:w="50" w:type="dxa"/>
               <w:bottom w:w="50" w:type="dxa"/>
-              <w:start w:w="90" w:type="dxa"/>
-              <w:end w:w="90" w:type="dxa"/>
-              <w:left w:w="90" w:type="dxa"/>
-              <w:right w:w="90" w:type="dxa"/>
+              <w:start w:w="70" w:type="dxa"/>
+              <w:end w:w="70" w:type="dxa"/>
+              <w:left w:w="70" w:type="dxa"/>
+              <w:right w:w="70" w:type="dxa"/>
             </w:tcMar>
             <w:vAlign w:val="center"/>
           </w:tcPr>
@@ -1572,6 +1572,7 @@
             <w:r>
               <w:rPr>
                 <w:b/>
+                <w:color w:val="2E3C74"/>
                 <w:sz w:val="18"/>
               </w:rPr>
               <w:t>7</w:t>
@@ -1580,116 +1581,15 @@
         </w:tc>
         <w:tc>
           <w:tcPr>
-            <w:tcW w:type="dxa" w:w="2074"/>
+            <w:tcW w:type="dxa" w:w="1224"/>
             <w:shd w:val="clear" w:color="auto" w:fill="EEF1F8"/>
             <w:tcMar>
               <w:top w:w="50" w:type="dxa"/>
               <w:bottom w:w="50" w:type="dxa"/>
-              <w:start w:w="90" w:type="dxa"/>
-              <w:end w:w="90" w:type="dxa"/>
-              <w:left w:w="90" w:type="dxa"/>
-              <w:right w:w="90" w:type="dxa"/>
-            </w:tcMar>
-            <w:vAlign w:val="center"/>
-          </w:tcPr>
-          <w:p>
-            <w:pPr>
-              <w:jc w:val="center"/>
-            </w:pPr>
-            <w:r>
-              <w:rPr>
-                <w:color w:val="6B7280"/>
-                <w:sz w:val="16"/>
-              </w:rPr>
-              <w:t>High</w:t>
-            </w:r>
-          </w:p>
-        </w:tc>
-      </w:tr>
-      <w:tr>
-        <w:tc>
-          <w:tcPr>
-            <w:tcW w:type="dxa" w:w="2074"/>
-            <w:shd w:val="clear" w:color="auto" w:fill="FFFFFF"/>
-            <w:tcMar>
-              <w:top w:w="50" w:type="dxa"/>
-              <w:bottom w:w="50" w:type="dxa"/>
-              <w:start w:w="90" w:type="dxa"/>
-              <w:end w:w="90" w:type="dxa"/>
-              <w:left w:w="90" w:type="dxa"/>
-              <w:right w:w="90" w:type="dxa"/>
-            </w:tcMar>
-            <w:vAlign w:val="center"/>
-          </w:tcPr>
-          <w:p>
-            <w:r>
-              <w:rPr>
-                <w:b/>
-                <w:color w:val="2E3C74"/>
-                <w:sz w:val="18"/>
-              </w:rPr>
-              <w:t>DXV-FRE-002</w:t>
-            </w:r>
-          </w:p>
-        </w:tc>
-        <w:tc>
-          <w:tcPr>
-            <w:tcW w:type="dxa" w:w="2074"/>
-            <w:shd w:val="clear" w:color="auto" w:fill="FFFFFF"/>
-            <w:tcMar>
-              <w:top w:w="50" w:type="dxa"/>
-              <w:bottom w:w="50" w:type="dxa"/>
-              <w:start w:w="90" w:type="dxa"/>
-              <w:end w:w="90" w:type="dxa"/>
-              <w:left w:w="90" w:type="dxa"/>
-              <w:right w:w="90" w:type="dxa"/>
-            </w:tcMar>
-            <w:vAlign w:val="center"/>
-          </w:tcPr>
-          <w:p>
-            <w:r>
-              <w:rPr>
-                <w:sz w:val="18"/>
-              </w:rPr>
-              <w:t>Read Iceberg quarantine tables and iterate contract tables safely</w:t>
-            </w:r>
-          </w:p>
-        </w:tc>
-        <w:tc>
-          <w:tcPr>
-            <w:tcW w:type="dxa" w:w="2074"/>
-            <w:shd w:val="clear" w:color="auto" w:fill="FFFFFF"/>
-            <w:tcMar>
-              <w:top w:w="50" w:type="dxa"/>
-              <w:bottom w:w="50" w:type="dxa"/>
-              <w:start w:w="90" w:type="dxa"/>
-              <w:end w:w="90" w:type="dxa"/>
-              <w:left w:w="90" w:type="dxa"/>
-              <w:right w:w="90" w:type="dxa"/>
-            </w:tcMar>
-            <w:vAlign w:val="center"/>
-          </w:tcPr>
-          <w:p>
-            <w:r>
-              <w:rPr>
-                <w:color w:val="3C4A66"/>
-                <w:sz w:val="17"/>
-              </w:rPr>
-              <w:t>Quarantine Source Acquisition</w:t>
-            </w:r>
-          </w:p>
-        </w:tc>
-        <w:tc>
-          <w:tcPr>
-            <w:tcW w:type="dxa" w:w="2074"/>
-            <w:shd w:val="clear" w:color="auto" w:fill="FFFFFF"/>
-            <w:tcMar>
-              <w:top w:w="50" w:type="dxa"/>
-              <w:bottom w:w="50" w:type="dxa"/>
-              <w:start w:w="90" w:type="dxa"/>
-              <w:end w:w="90" w:type="dxa"/>
-              <w:left w:w="90" w:type="dxa"/>
-              <w:right w:w="90" w:type="dxa"/>
+              <w:start w:w="70" w:type="dxa"/>
+              <w:end w:w="70" w:type="dxa"/>
+              <w:left w:w="70" w:type="dxa"/>
+              <w:right w:w="70" w:type="dxa"/>
             </w:tcMar>
             <w:vAlign w:val="center"/>
           </w:tcPr>
@@ -1700,36 +1600,11 @@
             <w:r>
               <w:rPr>
                 <w:b/>
-                <w:sz w:val="18"/>
+                <w:color w:val="B3261E"/>
+                <w:sz w:val="17"/>
+                <w:shd w:val="clear" w:color="auto" w:fill="FCE9E9"/>
               </w:rPr>
-              <w:t>6</w:t>
-            </w:r>
-          </w:p>
-        </w:tc>
-        <w:tc>
-          <w:tcPr>
-            <w:tcW w:type="dxa" w:w="2074"/>
-            <w:shd w:val="clear" w:color="auto" w:fill="FFFFFF"/>
-            <w:tcMar>
-              <w:top w:w="50" w:type="dxa"/>
-              <w:bottom w:w="50" w:type="dxa"/>
-              <w:start w:w="90" w:type="dxa"/>
-              <w:end w:w="90" w:type="dxa"/>
-              <w:left w:w="90" w:type="dxa"/>
-              <w:right w:w="90" w:type="dxa"/>
-            </w:tcMar>
-            <w:vAlign w:val="center"/>
-          </w:tcPr>
-          <w:p>
-            <w:pPr>
-              <w:jc w:val="center"/>
-            </w:pPr>
-            <w:r>
-              <w:rPr>
-                <w:color w:val="6B7280"/>
-                <w:sz w:val="16"/>
-              </w:rPr>
-              <w:t>High</w:t>
+              <w:t xml:space="preserve">  Highest  </w:t>
             </w:r>
           </w:p>
         </w:tc>
@@ -1737,15 +1612,15 @@
       <w:tr>
         <w:tc>
           <w:tcPr>
-            <w:tcW w:type="dxa" w:w="2074"/>
-            <w:shd w:val="clear" w:color="auto" w:fill="EEF1F8"/>
+            <w:tcW w:type="dxa" w:w="1440"/>
+            <w:shd w:val="clear" w:color="auto" w:fill="FFFFFF"/>
             <w:tcMar>
               <w:top w:w="50" w:type="dxa"/>
               <w:bottom w:w="50" w:type="dxa"/>
-              <w:start w:w="90" w:type="dxa"/>
-              <w:end w:w="90" w:type="dxa"/>
-              <w:left w:w="90" w:type="dxa"/>
-              <w:right w:w="90" w:type="dxa"/>
+              <w:start w:w="70" w:type="dxa"/>
+              <w:end w:w="70" w:type="dxa"/>
+              <w:left w:w="70" w:type="dxa"/>
+              <w:right w:w="70" w:type="dxa"/>
             </w:tcMar>
             <w:vAlign w:val="center"/>
           </w:tcPr>
@@ -1754,46 +1629,46 @@
               <w:rPr>
                 <w:b/>
                 <w:color w:val="2E3C74"/>
-                <w:sz w:val="18"/>
+                <w:sz w:val="17"/>
               </w:rPr>
-              <w:t>DXV-FRE-003</w:t>
+              <w:t>DXV-FRE-002</w:t>
             </w:r>
           </w:p>
         </w:tc>
         <w:tc>
           <w:tcPr>
-            <w:tcW w:type="dxa" w:w="2074"/>
-            <w:shd w:val="clear" w:color="auto" w:fill="EEF1F8"/>
+            <w:tcW w:type="dxa" w:w="3672"/>
+            <w:shd w:val="clear" w:color="auto" w:fill="FFFFFF"/>
             <w:tcMar>
               <w:top w:w="50" w:type="dxa"/>
               <w:bottom w:w="50" w:type="dxa"/>
-              <w:start w:w="90" w:type="dxa"/>
-              <w:end w:w="90" w:type="dxa"/>
-              <w:left w:w="90" w:type="dxa"/>
-              <w:right w:w="90" w:type="dxa"/>
+              <w:start w:w="70" w:type="dxa"/>
+              <w:end w:w="70" w:type="dxa"/>
+              <w:left w:w="70" w:type="dxa"/>
+              <w:right w:w="70" w:type="dxa"/>
             </w:tcMar>
             <w:vAlign w:val="center"/>
           </w:tcPr>
           <w:p>
             <w:r>
               <w:rPr>
-                <w:sz w:val="18"/>
+                <w:sz w:val="17"/>
               </w:rPr>
-              <w:t>Resolve, normalise and prefix output object paths correctly</w:t>
+              <w:t>Read Iceberg quarantine tables and iterate contract tables safely</w:t>
             </w:r>
           </w:p>
         </w:tc>
         <w:tc>
           <w:tcPr>
-            <w:tcW w:type="dxa" w:w="2074"/>
-            <w:shd w:val="clear" w:color="auto" w:fill="EEF1F8"/>
+            <w:tcW w:type="dxa" w:w="2664"/>
+            <w:shd w:val="clear" w:color="auto" w:fill="FFFFFF"/>
             <w:tcMar>
               <w:top w:w="50" w:type="dxa"/>
               <w:bottom w:w="50" w:type="dxa"/>
-              <w:start w:w="90" w:type="dxa"/>
-              <w:end w:w="90" w:type="dxa"/>
-              <w:left w:w="90" w:type="dxa"/>
-              <w:right w:w="90" w:type="dxa"/>
+              <w:start w:w="70" w:type="dxa"/>
+              <w:end w:w="70" w:type="dxa"/>
+              <w:left w:w="70" w:type="dxa"/>
+              <w:right w:w="70" w:type="dxa"/>
             </w:tcMar>
             <w:vAlign w:val="center"/>
           </w:tcPr>
@@ -1801,23 +1676,23 @@
             <w:r>
               <w:rPr>
                 <w:color w:val="3C4A66"/>
-                <w:sz w:val="17"/>
+                <w:sz w:val="16"/>
               </w:rPr>
-              <w:t>Output Layout &amp; Object Keys</w:t>
+              <w:t>Quarantine Source Acquisition</w:t>
             </w:r>
           </w:p>
         </w:tc>
         <w:tc>
           <w:tcPr>
-            <w:tcW w:type="dxa" w:w="2074"/>
-            <w:shd w:val="clear" w:color="auto" w:fill="EEF1F8"/>
+            <w:tcW w:type="dxa" w:w="648"/>
+            <w:shd w:val="clear" w:color="auto" w:fill="FFFFFF"/>
             <w:tcMar>
               <w:top w:w="50" w:type="dxa"/>
               <w:bottom w:w="50" w:type="dxa"/>
-              <w:start w:w="90" w:type="dxa"/>
-              <w:end w:w="90" w:type="dxa"/>
-              <w:left w:w="90" w:type="dxa"/>
-              <w:right w:w="90" w:type="dxa"/>
+              <w:start w:w="70" w:type="dxa"/>
+              <w:end w:w="70" w:type="dxa"/>
+              <w:left w:w="70" w:type="dxa"/>
+              <w:right w:w="70" w:type="dxa"/>
             </w:tcMar>
             <w:vAlign w:val="center"/>
           </w:tcPr>
@@ -1828,124 +1703,24 @@
             <w:r>
               <w:rPr>
                 <w:b/>
+                <w:color w:val="2E3C74"/>
                 <w:sz w:val="18"/>
               </w:rPr>
-              <w:t>5</w:t>
+              <w:t>6</w:t>
             </w:r>
           </w:p>
         </w:tc>
         <w:tc>
           <w:tcPr>
-            <w:tcW w:type="dxa" w:w="2074"/>
-            <w:shd w:val="clear" w:color="auto" w:fill="EEF1F8"/>
-            <w:tcMar>
-              <w:top w:w="50" w:type="dxa"/>
-              <w:bottom w:w="50" w:type="dxa"/>
-              <w:start w:w="90" w:type="dxa"/>
-              <w:end w:w="90" w:type="dxa"/>
-              <w:left w:w="90" w:type="dxa"/>
-              <w:right w:w="90" w:type="dxa"/>
-            </w:tcMar>
-            <w:vAlign w:val="center"/>
-          </w:tcPr>
-          <w:p>
-            <w:pPr>
-              <w:jc w:val="center"/>
-            </w:pPr>
-            <w:r>
-              <w:rPr>
-                <w:color w:val="6B7280"/>
-                <w:sz w:val="16"/>
-              </w:rPr>
-              <w:t>High</w:t>
-            </w:r>
-          </w:p>
-        </w:tc>
-      </w:tr>
-      <w:tr>
-        <w:tc>
-          <w:tcPr>
-            <w:tcW w:type="dxa" w:w="2074"/>
+            <w:tcW w:type="dxa" w:w="1224"/>
             <w:shd w:val="clear" w:color="auto" w:fill="FFFFFF"/>
             <w:tcMar>
               <w:top w:w="50" w:type="dxa"/>
               <w:bottom w:w="50" w:type="dxa"/>
-              <w:start w:w="90" w:type="dxa"/>
-              <w:end w:w="90" w:type="dxa"/>
-              <w:left w:w="90" w:type="dxa"/>
-              <w:right w:w="90" w:type="dxa"/>
-            </w:tcMar>
-            <w:vAlign w:val="center"/>
-          </w:tcPr>
-          <w:p>
-            <w:r>
-              <w:rPr>
-                <w:b/>
-                <w:color w:val="2E3C74"/>
-                <w:sz w:val="18"/>
-              </w:rPr>
-              <w:t>DXV-FRE-004</w:t>
-            </w:r>
-          </w:p>
-        </w:tc>
-        <w:tc>
-          <w:tcPr>
-            <w:tcW w:type="dxa" w:w="2074"/>
-            <w:shd w:val="clear" w:color="auto" w:fill="FFFFFF"/>
-            <w:tcMar>
-              <w:top w:w="50" w:type="dxa"/>
-              <w:bottom w:w="50" w:type="dxa"/>
-              <w:start w:w="90" w:type="dxa"/>
-              <w:end w:w="90" w:type="dxa"/>
-              <w:left w:w="90" w:type="dxa"/>
-              <w:right w:w="90" w:type="dxa"/>
-            </w:tcMar>
-            <w:vAlign w:val="center"/>
-          </w:tcPr>
-          <w:p>
-            <w:r>
-              <w:rPr>
-                <w:sz w:val="18"/>
-              </w:rPr>
-              <w:t>Generate clean-bad, aggregated and detailed export files correctly</w:t>
-            </w:r>
-          </w:p>
-        </w:tc>
-        <w:tc>
-          <w:tcPr>
-            <w:tcW w:type="dxa" w:w="2074"/>
-            <w:shd w:val="clear" w:color="auto" w:fill="FFFFFF"/>
-            <w:tcMar>
-              <w:top w:w="50" w:type="dxa"/>
-              <w:bottom w:w="50" w:type="dxa"/>
-              <w:start w:w="90" w:type="dxa"/>
-              <w:end w:w="90" w:type="dxa"/>
-              <w:left w:w="90" w:type="dxa"/>
-              <w:right w:w="90" w:type="dxa"/>
-            </w:tcMar>
-            <w:vAlign w:val="center"/>
-          </w:tcPr>
-          <w:p>
-            <w:r>
-              <w:rPr>
-                <w:color w:val="3C4A66"/>
-                <w:sz w:val="17"/>
-              </w:rPr>
-              <w:t>Data Export Content</w:t>
-            </w:r>
-          </w:p>
-        </w:tc>
-        <w:tc>
-          <w:tcPr>
-            <w:tcW w:type="dxa" w:w="2074"/>
-            <w:shd w:val="clear" w:color="auto" w:fill="FFFFFF"/>
-            <w:tcMar>
-              <w:top w:w="50" w:type="dxa"/>
-              <w:bottom w:w="50" w:type="dxa"/>
-              <w:start w:w="90" w:type="dxa"/>
-              <w:end w:w="90" w:type="dxa"/>
-              <w:left w:w="90" w:type="dxa"/>
-              <w:right w:w="90" w:type="dxa"/>
+              <w:start w:w="70" w:type="dxa"/>
+              <w:end w:w="70" w:type="dxa"/>
+              <w:left w:w="70" w:type="dxa"/>
+              <w:right w:w="70" w:type="dxa"/>
             </w:tcMar>
             <w:vAlign w:val="center"/>
           </w:tcPr>
@@ -1956,36 +1731,11 @@
             <w:r>
               <w:rPr>
                 <w:b/>
-                <w:sz w:val="18"/>
+                <w:color w:val="B3261E"/>
+                <w:sz w:val="17"/>
+                <w:shd w:val="clear" w:color="auto" w:fill="FCE9E9"/>
               </w:rPr>
-              <w:t>6</w:t>
-            </w:r>
-          </w:p>
-        </w:tc>
-        <w:tc>
-          <w:tcPr>
-            <w:tcW w:type="dxa" w:w="2074"/>
-            <w:shd w:val="clear" w:color="auto" w:fill="FFFFFF"/>
-            <w:tcMar>
-              <w:top w:w="50" w:type="dxa"/>
-              <w:bottom w:w="50" w:type="dxa"/>
-              <w:start w:w="90" w:type="dxa"/>
-              <w:end w:w="90" w:type="dxa"/>
-              <w:left w:w="90" w:type="dxa"/>
-              <w:right w:w="90" w:type="dxa"/>
-            </w:tcMar>
-            <w:vAlign w:val="center"/>
-          </w:tcPr>
-          <w:p>
-            <w:pPr>
-              <w:jc w:val="center"/>
-            </w:pPr>
-            <w:r>
-              <w:rPr>
-                <w:color w:val="6B7280"/>
-                <w:sz w:val="16"/>
-              </w:rPr>
-              <w:t>High</w:t>
+              <w:t xml:space="preserve">  Highest  </w:t>
             </w:r>
           </w:p>
         </w:tc>
@@ -1993,15 +1743,15 @@
       <w:tr>
         <w:tc>
           <w:tcPr>
-            <w:tcW w:type="dxa" w:w="2074"/>
+            <w:tcW w:type="dxa" w:w="1440"/>
             <w:shd w:val="clear" w:color="auto" w:fill="EEF1F8"/>
             <w:tcMar>
               <w:top w:w="50" w:type="dxa"/>
               <w:bottom w:w="50" w:type="dxa"/>
-              <w:start w:w="90" w:type="dxa"/>
-              <w:end w:w="90" w:type="dxa"/>
-              <w:left w:w="90" w:type="dxa"/>
-              <w:right w:w="90" w:type="dxa"/>
+              <w:start w:w="70" w:type="dxa"/>
+              <w:end w:w="70" w:type="dxa"/>
+              <w:left w:w="70" w:type="dxa"/>
+              <w:right w:w="70" w:type="dxa"/>
             </w:tcMar>
             <w:vAlign w:val="center"/>
           </w:tcPr>
@@ -2010,46 +1760,46 @@
               <w:rPr>
                 <w:b/>
                 <w:color w:val="2E3C74"/>
-                <w:sz w:val="18"/>
+                <w:sz w:val="17"/>
               </w:rPr>
-              <w:t>DXV-FRE-005</w:t>
+              <w:t>DXV-FRE-003</w:t>
             </w:r>
           </w:p>
         </w:tc>
         <w:tc>
           <w:tcPr>
-            <w:tcW w:type="dxa" w:w="2074"/>
+            <w:tcW w:type="dxa" w:w="3672"/>
             <w:shd w:val="clear" w:color="auto" w:fill="EEF1F8"/>
             <w:tcMar>
               <w:top w:w="50" w:type="dxa"/>
               <w:bottom w:w="50" w:type="dxa"/>
-              <w:start w:w="90" w:type="dxa"/>
-              <w:end w:w="90" w:type="dxa"/>
-              <w:left w:w="90" w:type="dxa"/>
-              <w:right w:w="90" w:type="dxa"/>
+              <w:start w:w="70" w:type="dxa"/>
+              <w:end w:w="70" w:type="dxa"/>
+              <w:left w:w="70" w:type="dxa"/>
+              <w:right w:w="70" w:type="dxa"/>
             </w:tcMar>
             <w:vAlign w:val="center"/>
           </w:tcPr>
           <w:p>
             <w:r>
               <w:rPr>
-                <w:sz w:val="18"/>
+                <w:sz w:val="17"/>
               </w:rPr>
-              <w:t>Emit the correct acquisition success / error envelope flag per run</w:t>
+              <w:t>Resolve, normalise and prefix output object paths correctly</w:t>
             </w:r>
           </w:p>
         </w:tc>
         <w:tc>
           <w:tcPr>
-            <w:tcW w:type="dxa" w:w="2074"/>
+            <w:tcW w:type="dxa" w:w="2664"/>
             <w:shd w:val="clear" w:color="auto" w:fill="EEF1F8"/>
             <w:tcMar>
               <w:top w:w="50" w:type="dxa"/>
               <w:bottom w:w="50" w:type="dxa"/>
-              <w:start w:w="90" w:type="dxa"/>
-              <w:end w:w="90" w:type="dxa"/>
-              <w:left w:w="90" w:type="dxa"/>
-              <w:right w:w="90" w:type="dxa"/>
+              <w:start w:w="70" w:type="dxa"/>
+              <w:end w:w="70" w:type="dxa"/>
+              <w:left w:w="70" w:type="dxa"/>
+              <w:right w:w="70" w:type="dxa"/>
             </w:tcMar>
             <w:vAlign w:val="center"/>
           </w:tcPr>
@@ -2057,23 +1807,23 @@
             <w:r>
               <w:rPr>
                 <w:color w:val="3C4A66"/>
-                <w:sz w:val="17"/>
+                <w:sz w:val="16"/>
               </w:rPr>
-              <w:t>Feedback Flags &amp; Envelope Semantics</w:t>
+              <w:t>Output Layout &amp; Object Keys</w:t>
             </w:r>
           </w:p>
         </w:tc>
         <w:tc>
           <w:tcPr>
-            <w:tcW w:type="dxa" w:w="2074"/>
+            <w:tcW w:type="dxa" w:w="648"/>
             <w:shd w:val="clear" w:color="auto" w:fill="EEF1F8"/>
             <w:tcMar>
               <w:top w:w="50" w:type="dxa"/>
               <w:bottom w:w="50" w:type="dxa"/>
-              <w:start w:w="90" w:type="dxa"/>
-              <w:end w:w="90" w:type="dxa"/>
-              <w:left w:w="90" w:type="dxa"/>
-              <w:right w:w="90" w:type="dxa"/>
+              <w:start w:w="70" w:type="dxa"/>
+              <w:end w:w="70" w:type="dxa"/>
+              <w:left w:w="70" w:type="dxa"/>
+              <w:right w:w="70" w:type="dxa"/>
             </w:tcMar>
             <w:vAlign w:val="center"/>
           </w:tcPr>
@@ -2084,124 +1834,24 @@
             <w:r>
               <w:rPr>
                 <w:b/>
+                <w:color w:val="2E3C74"/>
                 <w:sz w:val="18"/>
               </w:rPr>
-              <w:t>6</w:t>
+              <w:t>5</w:t>
             </w:r>
           </w:p>
         </w:tc>
         <w:tc>
           <w:tcPr>
-            <w:tcW w:type="dxa" w:w="2074"/>
+            <w:tcW w:type="dxa" w:w="1224"/>
             <w:shd w:val="clear" w:color="auto" w:fill="EEF1F8"/>
             <w:tcMar>
               <w:top w:w="50" w:type="dxa"/>
               <w:bottom w:w="50" w:type="dxa"/>
-              <w:start w:w="90" w:type="dxa"/>
-              <w:end w:w="90" w:type="dxa"/>
-              <w:left w:w="90" w:type="dxa"/>
-              <w:right w:w="90" w:type="dxa"/>
-            </w:tcMar>
-            <w:vAlign w:val="center"/>
-          </w:tcPr>
-          <w:p>
-            <w:pPr>
-              <w:jc w:val="center"/>
-            </w:pPr>
-            <w:r>
-              <w:rPr>
-                <w:color w:val="6B7280"/>
-                <w:sz w:val="16"/>
-              </w:rPr>
-              <w:t>High</w:t>
-            </w:r>
-          </w:p>
-        </w:tc>
-      </w:tr>
-      <w:tr>
-        <w:tc>
-          <w:tcPr>
-            <w:tcW w:type="dxa" w:w="2074"/>
-            <w:shd w:val="clear" w:color="auto" w:fill="FFFFFF"/>
-            <w:tcMar>
-              <w:top w:w="50" w:type="dxa"/>
-              <w:bottom w:w="50" w:type="dxa"/>
-              <w:start w:w="90" w:type="dxa"/>
-              <w:end w:w="90" w:type="dxa"/>
-              <w:left w:w="90" w:type="dxa"/>
-              <w:right w:w="90" w:type="dxa"/>
-            </w:tcMar>
-            <w:vAlign w:val="center"/>
-          </w:tcPr>
-          <w:p>
-            <w:r>
-              <w:rPr>
-                <w:b/>
-                <w:color w:val="2E3C74"/>
-                <w:sz w:val="18"/>
-              </w:rPr>
-              <w:t>DXV-FRE-006</w:t>
-            </w:r>
-          </w:p>
-        </w:tc>
-        <w:tc>
-          <w:tcPr>
-            <w:tcW w:type="dxa" w:w="2074"/>
-            <w:shd w:val="clear" w:color="auto" w:fill="FFFFFF"/>
-            <w:tcMar>
-              <w:top w:w="50" w:type="dxa"/>
-              <w:bottom w:w="50" w:type="dxa"/>
-              <w:start w:w="90" w:type="dxa"/>
-              <w:end w:w="90" w:type="dxa"/>
-              <w:left w:w="90" w:type="dxa"/>
-              <w:right w:w="90" w:type="dxa"/>
-            </w:tcMar>
-            <w:vAlign w:val="center"/>
-          </w:tcPr>
-          <w:p>
-            <w:r>
-              <w:rPr>
-                <w:sz w:val="18"/>
-              </w:rPr>
-              <w:t>Apply export file_format, separator and header rules correctly</w:t>
-            </w:r>
-          </w:p>
-        </w:tc>
-        <w:tc>
-          <w:tcPr>
-            <w:tcW w:type="dxa" w:w="2074"/>
-            <w:shd w:val="clear" w:color="auto" w:fill="FFFFFF"/>
-            <w:tcMar>
-              <w:top w:w="50" w:type="dxa"/>
-              <w:bottom w:w="50" w:type="dxa"/>
-              <w:start w:w="90" w:type="dxa"/>
-              <w:end w:w="90" w:type="dxa"/>
-              <w:left w:w="90" w:type="dxa"/>
-              <w:right w:w="90" w:type="dxa"/>
-            </w:tcMar>
-            <w:vAlign w:val="center"/>
-          </w:tcPr>
-          <w:p>
-            <w:r>
-              <w:rPr>
-                <w:color w:val="3C4A66"/>
-                <w:sz w:val="17"/>
-              </w:rPr>
-              <w:t>Writer Format &amp; Delimiters</w:t>
-            </w:r>
-          </w:p>
-        </w:tc>
-        <w:tc>
-          <w:tcPr>
-            <w:tcW w:type="dxa" w:w="2074"/>
-            <w:shd w:val="clear" w:color="auto" w:fill="FFFFFF"/>
-            <w:tcMar>
-              <w:top w:w="50" w:type="dxa"/>
-              <w:bottom w:w="50" w:type="dxa"/>
-              <w:start w:w="90" w:type="dxa"/>
-              <w:end w:w="90" w:type="dxa"/>
-              <w:left w:w="90" w:type="dxa"/>
-              <w:right w:w="90" w:type="dxa"/>
+              <w:start w:w="70" w:type="dxa"/>
+              <w:end w:w="70" w:type="dxa"/>
+              <w:left w:w="70" w:type="dxa"/>
+              <w:right w:w="70" w:type="dxa"/>
             </w:tcMar>
             <w:vAlign w:val="center"/>
           </w:tcPr>
@@ -2212,36 +1862,11 @@
             <w:r>
               <w:rPr>
                 <w:b/>
-                <w:sz w:val="18"/>
+                <w:color w:val="C2410C"/>
+                <w:sz w:val="17"/>
+                <w:shd w:val="clear" w:color="auto" w:fill="FFF1E6"/>
               </w:rPr>
-              <w:t>8</w:t>
-            </w:r>
-          </w:p>
-        </w:tc>
-        <w:tc>
-          <w:tcPr>
-            <w:tcW w:type="dxa" w:w="2074"/>
-            <w:shd w:val="clear" w:color="auto" w:fill="FFFFFF"/>
-            <w:tcMar>
-              <w:top w:w="50" w:type="dxa"/>
-              <w:bottom w:w="50" w:type="dxa"/>
-              <w:start w:w="90" w:type="dxa"/>
-              <w:end w:w="90" w:type="dxa"/>
-              <w:left w:w="90" w:type="dxa"/>
-              <w:right w:w="90" w:type="dxa"/>
-            </w:tcMar>
-            <w:vAlign w:val="center"/>
-          </w:tcPr>
-          <w:p>
-            <w:pPr>
-              <w:jc w:val="center"/>
-            </w:pPr>
-            <w:r>
-              <w:rPr>
-                <w:color w:val="6B7280"/>
-                <w:sz w:val="16"/>
-              </w:rPr>
-              <w:t>High</w:t>
+              <w:t xml:space="preserve">  High  </w:t>
             </w:r>
           </w:p>
         </w:tc>
@@ -2249,15 +1874,15 @@
       <w:tr>
         <w:tc>
           <w:tcPr>
-            <w:tcW w:type="dxa" w:w="2074"/>
-            <w:shd w:val="clear" w:color="auto" w:fill="EEF1F8"/>
+            <w:tcW w:type="dxa" w:w="1440"/>
+            <w:shd w:val="clear" w:color="auto" w:fill="FFFFFF"/>
             <w:tcMar>
               <w:top w:w="50" w:type="dxa"/>
               <w:bottom w:w="50" w:type="dxa"/>
-              <w:start w:w="90" w:type="dxa"/>
-              <w:end w:w="90" w:type="dxa"/>
-              <w:left w:w="90" w:type="dxa"/>
-              <w:right w:w="90" w:type="dxa"/>
+              <w:start w:w="70" w:type="dxa"/>
+              <w:end w:w="70" w:type="dxa"/>
+              <w:left w:w="70" w:type="dxa"/>
+              <w:right w:w="70" w:type="dxa"/>
             </w:tcMar>
             <w:vAlign w:val="center"/>
           </w:tcPr>
@@ -2266,46 +1891,46 @@
               <w:rPr>
                 <w:b/>
                 <w:color w:val="2E3C74"/>
-                <w:sz w:val="18"/>
+                <w:sz w:val="17"/>
               </w:rPr>
-              <w:t>DXV-FRE-007</w:t>
+              <w:t>DXV-FRE-004</w:t>
             </w:r>
           </w:p>
         </w:tc>
         <w:tc>
           <w:tcPr>
-            <w:tcW w:type="dxa" w:w="2074"/>
-            <w:shd w:val="clear" w:color="auto" w:fill="EEF1F8"/>
+            <w:tcW w:type="dxa" w:w="3672"/>
+            <w:shd w:val="clear" w:color="auto" w:fill="FFFFFF"/>
             <w:tcMar>
               <w:top w:w="50" w:type="dxa"/>
               <w:bottom w:w="50" w:type="dxa"/>
-              <w:start w:w="90" w:type="dxa"/>
-              <w:end w:w="90" w:type="dxa"/>
-              <w:left w:w="90" w:type="dxa"/>
-              <w:right w:w="90" w:type="dxa"/>
+              <w:start w:w="70" w:type="dxa"/>
+              <w:end w:w="70" w:type="dxa"/>
+              <w:left w:w="70" w:type="dxa"/>
+              <w:right w:w="70" w:type="dxa"/>
             </w:tcMar>
             <w:vAlign w:val="center"/>
           </w:tcPr>
           <w:p>
             <w:r>
               <w:rPr>
-                <w:sz w:val="18"/>
+                <w:sz w:val="17"/>
               </w:rPr>
-              <w:t>Align headerless export shape with RFFilespec ingest</w:t>
+              <w:t>Generate clean-bad, aggregated and detailed export files correctly</w:t>
             </w:r>
           </w:p>
         </w:tc>
         <w:tc>
           <w:tcPr>
-            <w:tcW w:type="dxa" w:w="2074"/>
-            <w:shd w:val="clear" w:color="auto" w:fill="EEF1F8"/>
+            <w:tcW w:type="dxa" w:w="2664"/>
+            <w:shd w:val="clear" w:color="auto" w:fill="FFFFFF"/>
             <w:tcMar>
               <w:top w:w="50" w:type="dxa"/>
               <w:bottom w:w="50" w:type="dxa"/>
-              <w:start w:w="90" w:type="dxa"/>
-              <w:end w:w="90" w:type="dxa"/>
-              <w:left w:w="90" w:type="dxa"/>
-              <w:right w:w="90" w:type="dxa"/>
+              <w:start w:w="70" w:type="dxa"/>
+              <w:end w:w="70" w:type="dxa"/>
+              <w:left w:w="70" w:type="dxa"/>
+              <w:right w:w="70" w:type="dxa"/>
             </w:tcMar>
             <w:vAlign w:val="center"/>
           </w:tcPr>
@@ -2313,23 +1938,23 @@
             <w:r>
               <w:rPr>
                 <w:color w:val="3C4A66"/>
-                <w:sz w:val="17"/>
+                <w:sz w:val="16"/>
               </w:rPr>
-              <w:t>RFFilespec / Headerless Compatibility</w:t>
+              <w:t>Data Export Content</w:t>
             </w:r>
           </w:p>
         </w:tc>
         <w:tc>
           <w:tcPr>
-            <w:tcW w:type="dxa" w:w="2074"/>
-            <w:shd w:val="clear" w:color="auto" w:fill="EEF1F8"/>
+            <w:tcW w:type="dxa" w:w="648"/>
+            <w:shd w:val="clear" w:color="auto" w:fill="FFFFFF"/>
             <w:tcMar>
               <w:top w:w="50" w:type="dxa"/>
               <w:bottom w:w="50" w:type="dxa"/>
-              <w:start w:w="90" w:type="dxa"/>
-              <w:end w:w="90" w:type="dxa"/>
-              <w:left w:w="90" w:type="dxa"/>
-              <w:right w:w="90" w:type="dxa"/>
+              <w:start w:w="70" w:type="dxa"/>
+              <w:end w:w="70" w:type="dxa"/>
+              <w:left w:w="70" w:type="dxa"/>
+              <w:right w:w="70" w:type="dxa"/>
             </w:tcMar>
             <w:vAlign w:val="center"/>
           </w:tcPr>
@@ -2340,124 +1965,24 @@
             <w:r>
               <w:rPr>
                 <w:b/>
+                <w:color w:val="2E3C74"/>
                 <w:sz w:val="18"/>
               </w:rPr>
-              <w:t>4</w:t>
+              <w:t>6</w:t>
             </w:r>
           </w:p>
         </w:tc>
         <w:tc>
           <w:tcPr>
-            <w:tcW w:type="dxa" w:w="2074"/>
-            <w:shd w:val="clear" w:color="auto" w:fill="EEF1F8"/>
-            <w:tcMar>
-              <w:top w:w="50" w:type="dxa"/>
-              <w:bottom w:w="50" w:type="dxa"/>
-              <w:start w:w="90" w:type="dxa"/>
-              <w:end w:w="90" w:type="dxa"/>
-              <w:left w:w="90" w:type="dxa"/>
-              <w:right w:w="90" w:type="dxa"/>
-            </w:tcMar>
-            <w:vAlign w:val="center"/>
-          </w:tcPr>
-          <w:p>
-            <w:pPr>
-              <w:jc w:val="center"/>
-            </w:pPr>
-            <w:r>
-              <w:rPr>
-                <w:color w:val="6B7280"/>
-                <w:sz w:val="16"/>
-              </w:rPr>
-              <w:t>Medi</w:t>
-            </w:r>
-          </w:p>
-        </w:tc>
-      </w:tr>
-      <w:tr>
-        <w:tc>
-          <w:tcPr>
-            <w:tcW w:type="dxa" w:w="2074"/>
+            <w:tcW w:type="dxa" w:w="1224"/>
             <w:shd w:val="clear" w:color="auto" w:fill="FFFFFF"/>
             <w:tcMar>
               <w:top w:w="50" w:type="dxa"/>
               <w:bottom w:w="50" w:type="dxa"/>
-              <w:start w:w="90" w:type="dxa"/>
-              <w:end w:w="90" w:type="dxa"/>
-              <w:left w:w="90" w:type="dxa"/>
-              <w:right w:w="90" w:type="dxa"/>
-            </w:tcMar>
-            <w:vAlign w:val="center"/>
-          </w:tcPr>
-          <w:p>
-            <w:r>
-              <w:rPr>
-                <w:b/>
-                <w:color w:val="2E3C74"/>
-                <w:sz w:val="18"/>
-              </w:rPr>
-              <w:t>DXV-FRE-008</w:t>
-            </w:r>
-          </w:p>
-        </w:tc>
-        <w:tc>
-          <w:tcPr>
-            <w:tcW w:type="dxa" w:w="2074"/>
-            <w:shd w:val="clear" w:color="auto" w:fill="FFFFFF"/>
-            <w:tcMar>
-              <w:top w:w="50" w:type="dxa"/>
-              <w:bottom w:w="50" w:type="dxa"/>
-              <w:start w:w="90" w:type="dxa"/>
-              <w:end w:w="90" w:type="dxa"/>
-              <w:left w:w="90" w:type="dxa"/>
-              <w:right w:w="90" w:type="dxa"/>
-            </w:tcMar>
-            <w:vAlign w:val="center"/>
-          </w:tcPr>
-          <w:p>
-            <w:r>
-              <w:rPr>
-                <w:sz w:val="18"/>
-              </w:rPr>
-              <w:t>Write .keep prefix markers and apply *.zip.flag naming conventions</w:t>
-            </w:r>
-          </w:p>
-        </w:tc>
-        <w:tc>
-          <w:tcPr>
-            <w:tcW w:type="dxa" w:w="2074"/>
-            <w:shd w:val="clear" w:color="auto" w:fill="FFFFFF"/>
-            <w:tcMar>
-              <w:top w:w="50" w:type="dxa"/>
-              <w:bottom w:w="50" w:type="dxa"/>
-              <w:start w:w="90" w:type="dxa"/>
-              <w:end w:w="90" w:type="dxa"/>
-              <w:left w:w="90" w:type="dxa"/>
-              <w:right w:w="90" w:type="dxa"/>
-            </w:tcMar>
-            <w:vAlign w:val="center"/>
-          </w:tcPr>
-          <w:p>
-            <w:r>
-              <w:rPr>
-                <w:color w:val="3C4A66"/>
-                <w:sz w:val="17"/>
-              </w:rPr>
-              <w:t>Object-Store Behaviour &amp; Naming</w:t>
-            </w:r>
-          </w:p>
-        </w:tc>
-        <w:tc>
-          <w:tcPr>
-            <w:tcW w:type="dxa" w:w="2074"/>
-            <w:shd w:val="clear" w:color="auto" w:fill="FFFFFF"/>
-            <w:tcMar>
-              <w:top w:w="50" w:type="dxa"/>
-              <w:bottom w:w="50" w:type="dxa"/>
-              <w:start w:w="90" w:type="dxa"/>
-              <w:end w:w="90" w:type="dxa"/>
-              <w:left w:w="90" w:type="dxa"/>
-              <w:right w:w="90" w:type="dxa"/>
+              <w:start w:w="70" w:type="dxa"/>
+              <w:end w:w="70" w:type="dxa"/>
+              <w:left w:w="70" w:type="dxa"/>
+              <w:right w:w="70" w:type="dxa"/>
             </w:tcMar>
             <w:vAlign w:val="center"/>
           </w:tcPr>
@@ -2468,36 +1993,11 @@
             <w:r>
               <w:rPr>
                 <w:b/>
-                <w:sz w:val="18"/>
+                <w:color w:val="B3261E"/>
+                <w:sz w:val="17"/>
+                <w:shd w:val="clear" w:color="auto" w:fill="FCE9E9"/>
               </w:rPr>
-              <w:t>6</w:t>
-            </w:r>
-          </w:p>
-        </w:tc>
-        <w:tc>
-          <w:tcPr>
-            <w:tcW w:type="dxa" w:w="2074"/>
-            <w:shd w:val="clear" w:color="auto" w:fill="FFFFFF"/>
-            <w:tcMar>
-              <w:top w:w="50" w:type="dxa"/>
-              <w:bottom w:w="50" w:type="dxa"/>
-              <w:start w:w="90" w:type="dxa"/>
-              <w:end w:w="90" w:type="dxa"/>
-              <w:left w:w="90" w:type="dxa"/>
-              <w:right w:w="90" w:type="dxa"/>
-            </w:tcMar>
-            <w:vAlign w:val="center"/>
-          </w:tcPr>
-          <w:p>
-            <w:pPr>
-              <w:jc w:val="center"/>
-            </w:pPr>
-            <w:r>
-              <w:rPr>
-                <w:color w:val="6B7280"/>
-                <w:sz w:val="16"/>
-              </w:rPr>
-              <w:t>High</w:t>
+              <w:t xml:space="preserve">  Highest  </w:t>
             </w:r>
           </w:p>
         </w:tc>
@@ -2505,15 +2005,15 @@
       <w:tr>
         <w:tc>
           <w:tcPr>
-            <w:tcW w:type="dxa" w:w="2074"/>
+            <w:tcW w:type="dxa" w:w="1440"/>
             <w:shd w:val="clear" w:color="auto" w:fill="EEF1F8"/>
             <w:tcMar>
               <w:top w:w="50" w:type="dxa"/>
               <w:bottom w:w="50" w:type="dxa"/>
-              <w:start w:w="90" w:type="dxa"/>
-              <w:end w:w="90" w:type="dxa"/>
-              <w:left w:w="90" w:type="dxa"/>
-              <w:right w:w="90" w:type="dxa"/>
+              <w:start w:w="70" w:type="dxa"/>
+              <w:end w:w="70" w:type="dxa"/>
+              <w:left w:w="70" w:type="dxa"/>
+              <w:right w:w="70" w:type="dxa"/>
             </w:tcMar>
             <w:vAlign w:val="center"/>
           </w:tcPr>
@@ -2522,46 +2022,46 @@
               <w:rPr>
                 <w:b/>
                 <w:color w:val="2E3C74"/>
-                <w:sz w:val="18"/>
+                <w:sz w:val="17"/>
               </w:rPr>
-              <w:t>DXV-FRE-009</w:t>
+              <w:t>DXV-FRE-005</w:t>
             </w:r>
           </w:p>
         </w:tc>
         <w:tc>
           <w:tcPr>
-            <w:tcW w:type="dxa" w:w="2074"/>
+            <w:tcW w:type="dxa" w:w="3672"/>
             <w:shd w:val="clear" w:color="auto" w:fill="EEF1F8"/>
             <w:tcMar>
               <w:top w:w="50" w:type="dxa"/>
               <w:bottom w:w="50" w:type="dxa"/>
-              <w:start w:w="90" w:type="dxa"/>
-              <w:end w:w="90" w:type="dxa"/>
-              <w:left w:w="90" w:type="dxa"/>
-              <w:right w:w="90" w:type="dxa"/>
+              <w:start w:w="70" w:type="dxa"/>
+              <w:end w:w="70" w:type="dxa"/>
+              <w:left w:w="70" w:type="dxa"/>
+              <w:right w:w="70" w:type="dxa"/>
             </w:tcMar>
             <w:vAlign w:val="center"/>
           </w:tcPr>
           <w:p>
             <w:r>
               <w:rPr>
-                <w:sz w:val="18"/>
+                <w:sz w:val="17"/>
               </w:rPr>
-              <w:t>Integrate exports with DXV pickup and align resubmit keys with ingest</w:t>
+              <w:t>Emit the correct acquisition success / error envelope flag per run</w:t>
             </w:r>
           </w:p>
         </w:tc>
         <w:tc>
           <w:tcPr>
-            <w:tcW w:type="dxa" w:w="2074"/>
+            <w:tcW w:type="dxa" w:w="2664"/>
             <w:shd w:val="clear" w:color="auto" w:fill="EEF1F8"/>
             <w:tcMar>
               <w:top w:w="50" w:type="dxa"/>
               <w:bottom w:w="50" w:type="dxa"/>
-              <w:start w:w="90" w:type="dxa"/>
-              <w:end w:w="90" w:type="dxa"/>
-              <w:left w:w="90" w:type="dxa"/>
-              <w:right w:w="90" w:type="dxa"/>
+              <w:start w:w="70" w:type="dxa"/>
+              <w:end w:w="70" w:type="dxa"/>
+              <w:left w:w="70" w:type="dxa"/>
+              <w:right w:w="70" w:type="dxa"/>
             </w:tcMar>
             <w:vAlign w:val="center"/>
           </w:tcPr>
@@ -2569,23 +2069,23 @@
             <w:r>
               <w:rPr>
                 <w:color w:val="3C4A66"/>
-                <w:sz w:val="17"/>
+                <w:sz w:val="16"/>
               </w:rPr>
-              <w:t>Downstream Integration &amp; Round-Trip</w:t>
+              <w:t>Feedback Flags &amp; Envelope Semantics</w:t>
             </w:r>
           </w:p>
         </w:tc>
         <w:tc>
           <w:tcPr>
-            <w:tcW w:type="dxa" w:w="2074"/>
+            <w:tcW w:type="dxa" w:w="648"/>
             <w:shd w:val="clear" w:color="auto" w:fill="EEF1F8"/>
             <w:tcMar>
               <w:top w:w="50" w:type="dxa"/>
               <w:bottom w:w="50" w:type="dxa"/>
-              <w:start w:w="90" w:type="dxa"/>
-              <w:end w:w="90" w:type="dxa"/>
-              <w:left w:w="90" w:type="dxa"/>
-              <w:right w:w="90" w:type="dxa"/>
+              <w:start w:w="70" w:type="dxa"/>
+              <w:end w:w="70" w:type="dxa"/>
+              <w:left w:w="70" w:type="dxa"/>
+              <w:right w:w="70" w:type="dxa"/>
             </w:tcMar>
             <w:vAlign w:val="center"/>
           </w:tcPr>
@@ -2596,6 +2096,7 @@
             <w:r>
               <w:rPr>
                 <w:b/>
+                <w:color w:val="2E3C74"/>
                 <w:sz w:val="18"/>
               </w:rPr>
               <w:t>6</w:t>
@@ -2604,116 +2105,15 @@
         </w:tc>
         <w:tc>
           <w:tcPr>
-            <w:tcW w:type="dxa" w:w="2074"/>
+            <w:tcW w:type="dxa" w:w="1224"/>
             <w:shd w:val="clear" w:color="auto" w:fill="EEF1F8"/>
             <w:tcMar>
               <w:top w:w="50" w:type="dxa"/>
               <w:bottom w:w="50" w:type="dxa"/>
-              <w:start w:w="90" w:type="dxa"/>
-              <w:end w:w="90" w:type="dxa"/>
-              <w:left w:w="90" w:type="dxa"/>
-              <w:right w:w="90" w:type="dxa"/>
-            </w:tcMar>
-            <w:vAlign w:val="center"/>
-          </w:tcPr>
-          <w:p>
-            <w:pPr>
-              <w:jc w:val="center"/>
-            </w:pPr>
-            <w:r>
-              <w:rPr>
-                <w:color w:val="6B7280"/>
-                <w:sz w:val="16"/>
-              </w:rPr>
-              <w:t>High</w:t>
-            </w:r>
-          </w:p>
-        </w:tc>
-      </w:tr>
-      <w:tr>
-        <w:tc>
-          <w:tcPr>
-            <w:tcW w:type="dxa" w:w="2074"/>
-            <w:shd w:val="clear" w:color="auto" w:fill="FFFFFF"/>
-            <w:tcMar>
-              <w:top w:w="50" w:type="dxa"/>
-              <w:bottom w:w="50" w:type="dxa"/>
-              <w:start w:w="90" w:type="dxa"/>
-              <w:end w:w="90" w:type="dxa"/>
-              <w:left w:w="90" w:type="dxa"/>
-              <w:right w:w="90" w:type="dxa"/>
-            </w:tcMar>
-            <w:vAlign w:val="center"/>
-          </w:tcPr>
-          <w:p>
-            <w:r>
-              <w:rPr>
-                <w:b/>
-                <w:color w:val="2E3C74"/>
-                <w:sz w:val="18"/>
-              </w:rPr>
-              <w:t>DXV-FRE-010</w:t>
-            </w:r>
-          </w:p>
-        </w:tc>
-        <w:tc>
-          <w:tcPr>
-            <w:tcW w:type="dxa" w:w="2074"/>
-            <w:shd w:val="clear" w:color="auto" w:fill="FFFFFF"/>
-            <w:tcMar>
-              <w:top w:w="50" w:type="dxa"/>
-              <w:bottom w:w="50" w:type="dxa"/>
-              <w:start w:w="90" w:type="dxa"/>
-              <w:end w:w="90" w:type="dxa"/>
-              <w:left w:w="90" w:type="dxa"/>
-              <w:right w:w="90" w:type="dxa"/>
-            </w:tcMar>
-            <w:vAlign w:val="center"/>
-          </w:tcPr>
-          <w:p>
-            <w:r>
-              <w:rPr>
-                <w:sz w:val="18"/>
-              </w:rPr>
-              <w:t>Validate non-functional qualities of the quarantine export stage</w:t>
-            </w:r>
-          </w:p>
-        </w:tc>
-        <w:tc>
-          <w:tcPr>
-            <w:tcW w:type="dxa" w:w="2074"/>
-            <w:shd w:val="clear" w:color="auto" w:fill="FFFFFF"/>
-            <w:tcMar>
-              <w:top w:w="50" w:type="dxa"/>
-              <w:bottom w:w="50" w:type="dxa"/>
-              <w:start w:w="90" w:type="dxa"/>
-              <w:end w:w="90" w:type="dxa"/>
-              <w:left w:w="90" w:type="dxa"/>
-              <w:right w:w="90" w:type="dxa"/>
-            </w:tcMar>
-            <w:vAlign w:val="center"/>
-          </w:tcPr>
-          <w:p>
-            <w:r>
-              <w:rPr>
-                <w:color w:val="3C4A66"/>
-                <w:sz w:val="17"/>
-              </w:rPr>
-              <w:t>Non-Functional Quality</w:t>
-            </w:r>
-          </w:p>
-        </w:tc>
-        <w:tc>
-          <w:tcPr>
-            <w:tcW w:type="dxa" w:w="2074"/>
-            <w:shd w:val="clear" w:color="auto" w:fill="FFFFFF"/>
-            <w:tcMar>
-              <w:top w:w="50" w:type="dxa"/>
-              <w:bottom w:w="50" w:type="dxa"/>
-              <w:start w:w="90" w:type="dxa"/>
-              <w:end w:w="90" w:type="dxa"/>
-              <w:left w:w="90" w:type="dxa"/>
-              <w:right w:w="90" w:type="dxa"/>
+              <w:start w:w="70" w:type="dxa"/>
+              <w:end w:w="70" w:type="dxa"/>
+              <w:left w:w="70" w:type="dxa"/>
+              <w:right w:w="70" w:type="dxa"/>
             </w:tcMar>
             <w:vAlign w:val="center"/>
           </w:tcPr>
@@ -2724,23 +2124,99 @@
             <w:r>
               <w:rPr>
                 <w:b/>
-                <w:sz w:val="18"/>
+                <w:color w:val="B3261E"/>
+                <w:sz w:val="17"/>
+                <w:shd w:val="clear" w:color="auto" w:fill="FCE9E9"/>
               </w:rPr>
-              <w:t>8</w:t>
+              <w:t xml:space="preserve">  Highest  </w:t>
+            </w:r>
+          </w:p>
+        </w:tc>
+      </w:tr>
+      <w:tr>
+        <w:tc>
+          <w:tcPr>
+            <w:tcW w:type="dxa" w:w="1440"/>
+            <w:shd w:val="clear" w:color="auto" w:fill="FFFFFF"/>
+            <w:tcMar>
+              <w:top w:w="50" w:type="dxa"/>
+              <w:bottom w:w="50" w:type="dxa"/>
+              <w:start w:w="70" w:type="dxa"/>
+              <w:end w:w="70" w:type="dxa"/>
+              <w:left w:w="70" w:type="dxa"/>
+              <w:right w:w="70" w:type="dxa"/>
+            </w:tcMar>
+            <w:vAlign w:val="center"/>
+          </w:tcPr>
+          <w:p>
+            <w:r>
+              <w:rPr>
+                <w:b/>
+                <w:color w:val="2E3C74"/>
+                <w:sz w:val="17"/>
+              </w:rPr>
+              <w:t>DXV-FRE-006</w:t>
             </w:r>
           </w:p>
         </w:tc>
         <w:tc>
           <w:tcPr>
-            <w:tcW w:type="dxa" w:w="2074"/>
+            <w:tcW w:type="dxa" w:w="3672"/>
             <w:shd w:val="clear" w:color="auto" w:fill="FFFFFF"/>
             <w:tcMar>
               <w:top w:w="50" w:type="dxa"/>
               <w:bottom w:w="50" w:type="dxa"/>
-              <w:start w:w="90" w:type="dxa"/>
-              <w:end w:w="90" w:type="dxa"/>
-              <w:left w:w="90" w:type="dxa"/>
-              <w:right w:w="90" w:type="dxa"/>
+              <w:start w:w="70" w:type="dxa"/>
+              <w:end w:w="70" w:type="dxa"/>
+              <w:left w:w="70" w:type="dxa"/>
+              <w:right w:w="70" w:type="dxa"/>
+            </w:tcMar>
+            <w:vAlign w:val="center"/>
+          </w:tcPr>
+          <w:p>
+            <w:r>
+              <w:rPr>
+                <w:sz w:val="17"/>
+              </w:rPr>
+              <w:t>Apply export file_format, separator and header rules correctly</w:t>
+            </w:r>
+          </w:p>
+        </w:tc>
+        <w:tc>
+          <w:tcPr>
+            <w:tcW w:type="dxa" w:w="2664"/>
+            <w:shd w:val="clear" w:color="auto" w:fill="FFFFFF"/>
+            <w:tcMar>
+              <w:top w:w="50" w:type="dxa"/>
+              <w:bottom w:w="50" w:type="dxa"/>
+              <w:start w:w="70" w:type="dxa"/>
+              <w:end w:w="70" w:type="dxa"/>
+              <w:left w:w="70" w:type="dxa"/>
+              <w:right w:w="70" w:type="dxa"/>
+            </w:tcMar>
+            <w:vAlign w:val="center"/>
+          </w:tcPr>
+          <w:p>
+            <w:r>
+              <w:rPr>
+                <w:color w:val="3C4A66"/>
+                <w:sz w:val="16"/>
+              </w:rPr>
+              <w:t>Writer Format &amp; Delimiters</w:t>
+            </w:r>
+          </w:p>
+        </w:tc>
+        <w:tc>
+          <w:tcPr>
+            <w:tcW w:type="dxa" w:w="648"/>
+            <w:shd w:val="clear" w:color="auto" w:fill="FFFFFF"/>
+            <w:tcMar>
+              <w:top w:w="50" w:type="dxa"/>
+              <w:bottom w:w="50" w:type="dxa"/>
+              <w:start w:w="70" w:type="dxa"/>
+              <w:end w:w="70" w:type="dxa"/>
+              <w:left w:w="70" w:type="dxa"/>
+              <w:right w:w="70" w:type="dxa"/>
             </w:tcMar>
             <w:vAlign w:val="center"/>
           </w:tcPr>
@@ -2750,10 +2226,564 @@
             </w:pPr>
             <w:r>
               <w:rPr>
-                <w:color w:val="6B7280"/>
+                <w:b/>
+                <w:color w:val="2E3C74"/>
+                <w:sz w:val="18"/>
+              </w:rPr>
+              <w:t>8</w:t>
+            </w:r>
+          </w:p>
+        </w:tc>
+        <w:tc>
+          <w:tcPr>
+            <w:tcW w:type="dxa" w:w="1224"/>
+            <w:shd w:val="clear" w:color="auto" w:fill="FFFFFF"/>
+            <w:tcMar>
+              <w:top w:w="50" w:type="dxa"/>
+              <w:bottom w:w="50" w:type="dxa"/>
+              <w:start w:w="70" w:type="dxa"/>
+              <w:end w:w="70" w:type="dxa"/>
+              <w:left w:w="70" w:type="dxa"/>
+              <w:right w:w="70" w:type="dxa"/>
+            </w:tcMar>
+            <w:vAlign w:val="center"/>
+          </w:tcPr>
+          <w:p>
+            <w:pPr>
+              <w:jc w:val="center"/>
+            </w:pPr>
+            <w:r>
+              <w:rPr>
+                <w:b/>
+                <w:color w:val="C2410C"/>
+                <w:sz w:val="17"/>
+                <w:shd w:val="clear" w:color="auto" w:fill="FFF1E6"/>
+              </w:rPr>
+              <w:t xml:space="preserve">  High  </w:t>
+            </w:r>
+          </w:p>
+        </w:tc>
+      </w:tr>
+      <w:tr>
+        <w:tc>
+          <w:tcPr>
+            <w:tcW w:type="dxa" w:w="1440"/>
+            <w:shd w:val="clear" w:color="auto" w:fill="EEF1F8"/>
+            <w:tcMar>
+              <w:top w:w="50" w:type="dxa"/>
+              <w:bottom w:w="50" w:type="dxa"/>
+              <w:start w:w="70" w:type="dxa"/>
+              <w:end w:w="70" w:type="dxa"/>
+              <w:left w:w="70" w:type="dxa"/>
+              <w:right w:w="70" w:type="dxa"/>
+            </w:tcMar>
+            <w:vAlign w:val="center"/>
+          </w:tcPr>
+          <w:p>
+            <w:r>
+              <w:rPr>
+                <w:b/>
+                <w:color w:val="2E3C74"/>
+                <w:sz w:val="17"/>
+              </w:rPr>
+              <w:t>DXV-FRE-007</w:t>
+            </w:r>
+          </w:p>
+        </w:tc>
+        <w:tc>
+          <w:tcPr>
+            <w:tcW w:type="dxa" w:w="3672"/>
+            <w:shd w:val="clear" w:color="auto" w:fill="EEF1F8"/>
+            <w:tcMar>
+              <w:top w:w="50" w:type="dxa"/>
+              <w:bottom w:w="50" w:type="dxa"/>
+              <w:start w:w="70" w:type="dxa"/>
+              <w:end w:w="70" w:type="dxa"/>
+              <w:left w:w="70" w:type="dxa"/>
+              <w:right w:w="70" w:type="dxa"/>
+            </w:tcMar>
+            <w:vAlign w:val="center"/>
+          </w:tcPr>
+          <w:p>
+            <w:r>
+              <w:rPr>
+                <w:sz w:val="17"/>
+              </w:rPr>
+              <w:t>Align headerless export shape with RFFilespec ingest</w:t>
+            </w:r>
+          </w:p>
+        </w:tc>
+        <w:tc>
+          <w:tcPr>
+            <w:tcW w:type="dxa" w:w="2664"/>
+            <w:shd w:val="clear" w:color="auto" w:fill="EEF1F8"/>
+            <w:tcMar>
+              <w:top w:w="50" w:type="dxa"/>
+              <w:bottom w:w="50" w:type="dxa"/>
+              <w:start w:w="70" w:type="dxa"/>
+              <w:end w:w="70" w:type="dxa"/>
+              <w:left w:w="70" w:type="dxa"/>
+              <w:right w:w="70" w:type="dxa"/>
+            </w:tcMar>
+            <w:vAlign w:val="center"/>
+          </w:tcPr>
+          <w:p>
+            <w:r>
+              <w:rPr>
+                <w:color w:val="3C4A66"/>
                 <w:sz w:val="16"/>
               </w:rPr>
-              <w:t>High</w:t>
+              <w:t>RFFilespec / Headerless Compatibility</w:t>
+            </w:r>
+          </w:p>
+        </w:tc>
+        <w:tc>
+          <w:tcPr>
+            <w:tcW w:type="dxa" w:w="648"/>
+            <w:shd w:val="clear" w:color="auto" w:fill="EEF1F8"/>
+            <w:tcMar>
+              <w:top w:w="50" w:type="dxa"/>
+              <w:bottom w:w="50" w:type="dxa"/>
+              <w:start w:w="70" w:type="dxa"/>
+              <w:end w:w="70" w:type="dxa"/>
+              <w:left w:w="70" w:type="dxa"/>
+              <w:right w:w="70" w:type="dxa"/>
+            </w:tcMar>
+            <w:vAlign w:val="center"/>
+          </w:tcPr>
+          <w:p>
+            <w:pPr>
+              <w:jc w:val="center"/>
+            </w:pPr>
+            <w:r>
+              <w:rPr>
+                <w:b/>
+                <w:color w:val="2E3C74"/>
+                <w:sz w:val="18"/>
+              </w:rPr>
+              <w:t>4</w:t>
+            </w:r>
+          </w:p>
+        </w:tc>
+        <w:tc>
+          <w:tcPr>
+            <w:tcW w:type="dxa" w:w="1224"/>
+            <w:shd w:val="clear" w:color="auto" w:fill="EEF1F8"/>
+            <w:tcMar>
+              <w:top w:w="50" w:type="dxa"/>
+              <w:bottom w:w="50" w:type="dxa"/>
+              <w:start w:w="70" w:type="dxa"/>
+              <w:end w:w="70" w:type="dxa"/>
+              <w:left w:w="70" w:type="dxa"/>
+              <w:right w:w="70" w:type="dxa"/>
+            </w:tcMar>
+            <w:vAlign w:val="center"/>
+          </w:tcPr>
+          <w:p>
+            <w:pPr>
+              <w:jc w:val="center"/>
+            </w:pPr>
+            <w:r>
+              <w:rPr>
+                <w:b/>
+                <w:color w:val="8D6E00"/>
+                <w:sz w:val="17"/>
+                <w:shd w:val="clear" w:color="auto" w:fill="FFF8E1"/>
+              </w:rPr>
+              <w:t xml:space="preserve">  Medium  </w:t>
+            </w:r>
+          </w:p>
+        </w:tc>
+      </w:tr>
+      <w:tr>
+        <w:tc>
+          <w:tcPr>
+            <w:tcW w:type="dxa" w:w="1440"/>
+            <w:shd w:val="clear" w:color="auto" w:fill="FFFFFF"/>
+            <w:tcMar>
+              <w:top w:w="50" w:type="dxa"/>
+              <w:bottom w:w="50" w:type="dxa"/>
+              <w:start w:w="70" w:type="dxa"/>
+              <w:end w:w="70" w:type="dxa"/>
+              <w:left w:w="70" w:type="dxa"/>
+              <w:right w:w="70" w:type="dxa"/>
+            </w:tcMar>
+            <w:vAlign w:val="center"/>
+          </w:tcPr>
+          <w:p>
+            <w:r>
+              <w:rPr>
+                <w:b/>
+                <w:color w:val="2E3C74"/>
+                <w:sz w:val="17"/>
+              </w:rPr>
+              <w:t>DXV-FRE-008</w:t>
+            </w:r>
+          </w:p>
+        </w:tc>
+        <w:tc>
+          <w:tcPr>
+            <w:tcW w:type="dxa" w:w="3672"/>
+            <w:shd w:val="clear" w:color="auto" w:fill="FFFFFF"/>
+            <w:tcMar>
+              <w:top w:w="50" w:type="dxa"/>
+              <w:bottom w:w="50" w:type="dxa"/>
+              <w:start w:w="70" w:type="dxa"/>
+              <w:end w:w="70" w:type="dxa"/>
+              <w:left w:w="70" w:type="dxa"/>
+              <w:right w:w="70" w:type="dxa"/>
+            </w:tcMar>
+            <w:vAlign w:val="center"/>
+          </w:tcPr>
+          <w:p>
+            <w:r>
+              <w:rPr>
+                <w:sz w:val="17"/>
+              </w:rPr>
+              <w:t>Write .keep prefix markers and apply *.zip.flag naming conventions</w:t>
+            </w:r>
+          </w:p>
+        </w:tc>
+        <w:tc>
+          <w:tcPr>
+            <w:tcW w:type="dxa" w:w="2664"/>
+            <w:shd w:val="clear" w:color="auto" w:fill="FFFFFF"/>
+            <w:tcMar>
+              <w:top w:w="50" w:type="dxa"/>
+              <w:bottom w:w="50" w:type="dxa"/>
+              <w:start w:w="70" w:type="dxa"/>
+              <w:end w:w="70" w:type="dxa"/>
+              <w:left w:w="70" w:type="dxa"/>
+              <w:right w:w="70" w:type="dxa"/>
+            </w:tcMar>
+            <w:vAlign w:val="center"/>
+          </w:tcPr>
+          <w:p>
+            <w:r>
+              <w:rPr>
+                <w:color w:val="3C4A66"/>
+                <w:sz w:val="16"/>
+              </w:rPr>
+              <w:t>Object-Store Behaviour &amp; Naming</w:t>
+            </w:r>
+          </w:p>
+        </w:tc>
+        <w:tc>
+          <w:tcPr>
+            <w:tcW w:type="dxa" w:w="648"/>
+            <w:shd w:val="clear" w:color="auto" w:fill="FFFFFF"/>
+            <w:tcMar>
+              <w:top w:w="50" w:type="dxa"/>
+              <w:bottom w:w="50" w:type="dxa"/>
+              <w:start w:w="70" w:type="dxa"/>
+              <w:end w:w="70" w:type="dxa"/>
+              <w:left w:w="70" w:type="dxa"/>
+              <w:right w:w="70" w:type="dxa"/>
+            </w:tcMar>
+            <w:vAlign w:val="center"/>
+          </w:tcPr>
+          <w:p>
+            <w:pPr>
+              <w:jc w:val="center"/>
+            </w:pPr>
+            <w:r>
+              <w:rPr>
+                <w:b/>
+                <w:color w:val="2E3C74"/>
+                <w:sz w:val="18"/>
+              </w:rPr>
+              <w:t>6</w:t>
+            </w:r>
+          </w:p>
+        </w:tc>
+        <w:tc>
+          <w:tcPr>
+            <w:tcW w:type="dxa" w:w="1224"/>
+            <w:shd w:val="clear" w:color="auto" w:fill="FFFFFF"/>
+            <w:tcMar>
+              <w:top w:w="50" w:type="dxa"/>
+              <w:bottom w:w="50" w:type="dxa"/>
+              <w:start w:w="70" w:type="dxa"/>
+              <w:end w:w="70" w:type="dxa"/>
+              <w:left w:w="70" w:type="dxa"/>
+              <w:right w:w="70" w:type="dxa"/>
+            </w:tcMar>
+            <w:vAlign w:val="center"/>
+          </w:tcPr>
+          <w:p>
+            <w:pPr>
+              <w:jc w:val="center"/>
+            </w:pPr>
+            <w:r>
+              <w:rPr>
+                <w:b/>
+                <w:color w:val="C2410C"/>
+                <w:sz w:val="17"/>
+                <w:shd w:val="clear" w:color="auto" w:fill="FFF1E6"/>
+              </w:rPr>
+              <w:t xml:space="preserve">  High  </w:t>
+            </w:r>
+          </w:p>
+        </w:tc>
+      </w:tr>
+      <w:tr>
+        <w:tc>
+          <w:tcPr>
+            <w:tcW w:type="dxa" w:w="1440"/>
+            <w:shd w:val="clear" w:color="auto" w:fill="EEF1F8"/>
+            <w:tcMar>
+              <w:top w:w="50" w:type="dxa"/>
+              <w:bottom w:w="50" w:type="dxa"/>
+              <w:start w:w="70" w:type="dxa"/>
+              <w:end w:w="70" w:type="dxa"/>
+              <w:left w:w="70" w:type="dxa"/>
+              <w:right w:w="70" w:type="dxa"/>
+            </w:tcMar>
+            <w:vAlign w:val="center"/>
+          </w:tcPr>
+          <w:p>
+            <w:r>
+              <w:rPr>
+                <w:b/>
+                <w:color w:val="2E3C74"/>
+                <w:sz w:val="17"/>
+              </w:rPr>
+              <w:t>DXV-FRE-009</w:t>
+            </w:r>
+          </w:p>
+        </w:tc>
+        <w:tc>
+          <w:tcPr>
+            <w:tcW w:type="dxa" w:w="3672"/>
+            <w:shd w:val="clear" w:color="auto" w:fill="EEF1F8"/>
+            <w:tcMar>
+              <w:top w:w="50" w:type="dxa"/>
+              <w:bottom w:w="50" w:type="dxa"/>
+              <w:start w:w="70" w:type="dxa"/>
+              <w:end w:w="70" w:type="dxa"/>
+              <w:left w:w="70" w:type="dxa"/>
+              <w:right w:w="70" w:type="dxa"/>
+            </w:tcMar>
+            <w:vAlign w:val="center"/>
+          </w:tcPr>
+          <w:p>
+            <w:r>
+              <w:rPr>
+                <w:sz w:val="17"/>
+              </w:rPr>
+              <w:t>Integrate exports with DXV pickup and align resubmit keys with ingest</w:t>
+            </w:r>
+          </w:p>
+        </w:tc>
+        <w:tc>
+          <w:tcPr>
+            <w:tcW w:type="dxa" w:w="2664"/>
+            <w:shd w:val="clear" w:color="auto" w:fill="EEF1F8"/>
+            <w:tcMar>
+              <w:top w:w="50" w:type="dxa"/>
+              <w:bottom w:w="50" w:type="dxa"/>
+              <w:start w:w="70" w:type="dxa"/>
+              <w:end w:w="70" w:type="dxa"/>
+              <w:left w:w="70" w:type="dxa"/>
+              <w:right w:w="70" w:type="dxa"/>
+            </w:tcMar>
+            <w:vAlign w:val="center"/>
+          </w:tcPr>
+          <w:p>
+            <w:r>
+              <w:rPr>
+                <w:color w:val="3C4A66"/>
+                <w:sz w:val="16"/>
+              </w:rPr>
+              <w:t>Downstream Integration &amp; Round-Trip</w:t>
+            </w:r>
+          </w:p>
+        </w:tc>
+        <w:tc>
+          <w:tcPr>
+            <w:tcW w:type="dxa" w:w="648"/>
+            <w:shd w:val="clear" w:color="auto" w:fill="EEF1F8"/>
+            <w:tcMar>
+              <w:top w:w="50" w:type="dxa"/>
+              <w:bottom w:w="50" w:type="dxa"/>
+              <w:start w:w="70" w:type="dxa"/>
+              <w:end w:w="70" w:type="dxa"/>
+              <w:left w:w="70" w:type="dxa"/>
+              <w:right w:w="70" w:type="dxa"/>
+            </w:tcMar>
+            <w:vAlign w:val="center"/>
+          </w:tcPr>
+          <w:p>
+            <w:pPr>
+              <w:jc w:val="center"/>
+            </w:pPr>
+            <w:r>
+              <w:rPr>
+                <w:b/>
+                <w:color w:val="2E3C74"/>
+                <w:sz w:val="18"/>
+              </w:rPr>
+              <w:t>6</w:t>
+            </w:r>
+          </w:p>
+        </w:tc>
+        <w:tc>
+          <w:tcPr>
+            <w:tcW w:type="dxa" w:w="1224"/>
+            <w:shd w:val="clear" w:color="auto" w:fill="EEF1F8"/>
+            <w:tcMar>
+              <w:top w:w="50" w:type="dxa"/>
+              <w:bottom w:w="50" w:type="dxa"/>
+              <w:start w:w="70" w:type="dxa"/>
+              <w:end w:w="70" w:type="dxa"/>
+              <w:left w:w="70" w:type="dxa"/>
+              <w:right w:w="70" w:type="dxa"/>
+            </w:tcMar>
+            <w:vAlign w:val="center"/>
+          </w:tcPr>
+          <w:p>
+            <w:pPr>
+              <w:jc w:val="center"/>
+            </w:pPr>
+            <w:r>
+              <w:rPr>
+                <w:b/>
+                <w:color w:val="C2410C"/>
+                <w:sz w:val="17"/>
+                <w:shd w:val="clear" w:color="auto" w:fill="FFF1E6"/>
+              </w:rPr>
+              <w:t xml:space="preserve">  High  </w:t>
+            </w:r>
+          </w:p>
+        </w:tc>
+      </w:tr>
+      <w:tr>
+        <w:tc>
+          <w:tcPr>
+            <w:tcW w:type="dxa" w:w="1440"/>
+            <w:shd w:val="clear" w:color="auto" w:fill="FFFFFF"/>
+            <w:tcMar>
+              <w:top w:w="50" w:type="dxa"/>
+              <w:bottom w:w="50" w:type="dxa"/>
+              <w:start w:w="70" w:type="dxa"/>
+              <w:end w:w="70" w:type="dxa"/>
+              <w:left w:w="70" w:type="dxa"/>
+              <w:right w:w="70" w:type="dxa"/>
+            </w:tcMar>
+            <w:vAlign w:val="center"/>
+          </w:tcPr>
+          <w:p>
+            <w:r>
+              <w:rPr>
+                <w:b/>
+                <w:color w:val="2E3C74"/>
+                <w:sz w:val="17"/>
+              </w:rPr>
+              <w:t>DXV-FRE-010</w:t>
+            </w:r>
+          </w:p>
+        </w:tc>
+        <w:tc>
+          <w:tcPr>
+            <w:tcW w:type="dxa" w:w="3672"/>
+            <w:shd w:val="clear" w:color="auto" w:fill="FFFFFF"/>
+            <w:tcMar>
+              <w:top w:w="50" w:type="dxa"/>
+              <w:bottom w:w="50" w:type="dxa"/>
+              <w:start w:w="70" w:type="dxa"/>
+              <w:end w:w="70" w:type="dxa"/>
+              <w:left w:w="70" w:type="dxa"/>
+              <w:right w:w="70" w:type="dxa"/>
+            </w:tcMar>
+            <w:vAlign w:val="center"/>
+          </w:tcPr>
+          <w:p>
+            <w:r>
+              <w:rPr>
+                <w:sz w:val="17"/>
+              </w:rPr>
+              <w:t>Validate non-functional qualities of the quarantine export stage</w:t>
+            </w:r>
+          </w:p>
+        </w:tc>
+        <w:tc>
+          <w:tcPr>
+            <w:tcW w:type="dxa" w:w="2664"/>
+            <w:shd w:val="clear" w:color="auto" w:fill="FFFFFF"/>
+            <w:tcMar>
+              <w:top w:w="50" w:type="dxa"/>
+              <w:bottom w:w="50" w:type="dxa"/>
+              <w:start w:w="70" w:type="dxa"/>
+              <w:end w:w="70" w:type="dxa"/>
+              <w:left w:w="70" w:type="dxa"/>
+              <w:right w:w="70" w:type="dxa"/>
+            </w:tcMar>
+            <w:vAlign w:val="center"/>
+          </w:tcPr>
+          <w:p>
+            <w:r>
+              <w:rPr>
+                <w:color w:val="3C4A66"/>
+                <w:sz w:val="16"/>
+              </w:rPr>
+              <w:t>Non-Functional Quality</w:t>
+            </w:r>
+          </w:p>
+        </w:tc>
+        <w:tc>
+          <w:tcPr>
+            <w:tcW w:type="dxa" w:w="648"/>
+            <w:shd w:val="clear" w:color="auto" w:fill="FFFFFF"/>
+            <w:tcMar>
+              <w:top w:w="50" w:type="dxa"/>
+              <w:bottom w:w="50" w:type="dxa"/>
+              <w:start w:w="70" w:type="dxa"/>
+              <w:end w:w="70" w:type="dxa"/>
+              <w:left w:w="70" w:type="dxa"/>
+              <w:right w:w="70" w:type="dxa"/>
+            </w:tcMar>
+            <w:vAlign w:val="center"/>
+          </w:tcPr>
+          <w:p>
+            <w:pPr>
+              <w:jc w:val="center"/>
+            </w:pPr>
+            <w:r>
+              <w:rPr>
+                <w:b/>
+                <w:color w:val="2E3C74"/>
+                <w:sz w:val="18"/>
+              </w:rPr>
+              <w:t>8</w:t>
+            </w:r>
+          </w:p>
+        </w:tc>
+        <w:tc>
+          <w:tcPr>
+            <w:tcW w:type="dxa" w:w="1224"/>
+            <w:shd w:val="clear" w:color="auto" w:fill="FFFFFF"/>
+            <w:tcMar>
+              <w:top w:w="50" w:type="dxa"/>
+              <w:bottom w:w="50" w:type="dxa"/>
+              <w:start w:w="70" w:type="dxa"/>
+              <w:end w:w="70" w:type="dxa"/>
+              <w:left w:w="70" w:type="dxa"/>
+              <w:right w:w="70" w:type="dxa"/>
+            </w:tcMar>
+            <w:vAlign w:val="center"/>
+          </w:tcPr>
+          <w:p>
+            <w:pPr>
+              <w:jc w:val="center"/>
+            </w:pPr>
+            <w:r>
+              <w:rPr>
+                <w:b/>
+                <w:color w:val="C2410C"/>
+                <w:sz w:val="17"/>
+                <w:shd w:val="clear" w:color="auto" w:fill="FFF1E6"/>
+              </w:rPr>
+              <w:t xml:space="preserve">  High  </w:t>
             </w:r>
           </w:p>
         </w:tc>
@@ -2783,7 +2813,6 @@
     </w:p>
     <w:tbl>
       <w:tblPr>
-        <w:tblW w:type="auto" w:w="0"/>
         <w:jc w:val="center"/>
         <w:tblLook w:firstColumn="1" w:firstRow="1" w:lastColumn="0" w:lastRow="0" w:noHBand="0" w:noVBand="1" w:val="04A0"/>
         <w:tblBorders>
@@ -2795,14 +2824,15 @@
           <w:insideV w:val="none" w:sz="0" w:space="0" w:color="auto"/>
         </w:tblBorders>
         <w:tblLayout w:type="fixed"/>
+        <w:tblW w:w="10296" w:type="dxa"/>
       </w:tblPr>
       <w:tblGrid>
-        <w:gridCol w:w="10368"/>
+        <w:gridCol w:w="10296"/>
       </w:tblGrid>
       <w:tr>
         <w:tc>
           <w:tcPr>
-            <w:tcW w:type="dxa" w:w="10296"/>
+            <w:tcW w:w="10296" w:type="dxa"/>
             <w:shd w:val="clear" w:color="auto" w:fill="EAF1FB"/>
             <w:tcBorders>
               <w:left w:val="single" w:sz="24" w:space="0" w:color="2E6FD6"/>

</xml_diff>